<commit_message>
fix: updated deps to work as uv tool and local install, commiting to preserve working version (presumed)
</commit_message>
<xml_diff>
--- a/example/2 KAD/1 LAP/Learning and Assessment Plan (F122A14).docx
+++ b/example/2 KAD/1 LAP/Learning and Assessment Plan (F122A14).docx
@@ -126,7 +126,7 @@
           </w:tcPr>
           <w:p>
             <w:r>
-              <w:t>2024, S2</w:t>
+              <w:t>2025, S1</w:t>
             </w:r>
           </w:p>
         </w:tc>
@@ -476,8 +476,6 @@
             </w:r>
             <w:r>
               <w:br/>
-              <w:t>- USB (at least 16GB)</w:t>
-              <w:br/>
               <w:t>- Adequate home workstation for out of class activities</w:t>
               <w:br/>
               <w:t>- Student's personal notes</w:t>
@@ -758,14 +756,9 @@
             <w:tcW w:w="1002" w:type="pct"/>
           </w:tcPr>
           <w:p>
-            <w:pPr>
-              <w:spacing w:before="60" w:after="60"/>
-              <w:rPr>
-                <w:rFonts w:cs="Arial"/>
-                <w:szCs w:val="22"/>
-                <w:lang w:val="en-US"/>
-              </w:rPr>
-            </w:pPr>
+            <w:r>
+              <w:t>Hong Fu</w:t>
+            </w:r>
           </w:p>
         </w:tc>
         <w:tc>
@@ -773,14 +766,9 @@
             <w:tcW w:w="746" w:type="pct"/>
           </w:tcPr>
           <w:p>
-            <w:pPr>
-              <w:spacing w:before="60" w:after="60"/>
-              <w:rPr>
-                <w:rFonts w:cs="Arial"/>
-                <w:szCs w:val="22"/>
-                <w:lang w:val="en-US"/>
-              </w:rPr>
-            </w:pPr>
+            <w:r>
+              <w:t>--</w:t>
+            </w:r>
           </w:p>
         </w:tc>
         <w:tc>
@@ -788,14 +776,9 @@
             <w:tcW w:w="1832" w:type="pct"/>
           </w:tcPr>
           <w:p>
-            <w:pPr>
-              <w:spacing w:before="60" w:after="60"/>
-              <w:rPr>
-                <w:rFonts w:cs="Arial"/>
-                <w:szCs w:val="22"/>
-                <w:lang w:val="en-US"/>
-              </w:rPr>
-            </w:pPr>
+            <w:r>
+              <w:t>hong.fu@nmtafe.wa.edu.au</w:t>
+            </w:r>
           </w:p>
         </w:tc>
         <w:tc>
@@ -803,14 +786,9 @@
             <w:tcW w:w="748" w:type="pct"/>
           </w:tcPr>
           <w:p>
-            <w:pPr>
-              <w:spacing w:before="60" w:after="60"/>
-              <w:rPr>
-                <w:rFonts w:cs="Arial"/>
-                <w:szCs w:val="22"/>
-                <w:lang w:val="en-US"/>
-              </w:rPr>
-            </w:pPr>
+            <w:r>
+              <w:t>in-class or by appointment</w:t>
+            </w:r>
           </w:p>
         </w:tc>
         <w:tc>
@@ -818,14 +796,9 @@
             <w:tcW w:w="673" w:type="pct"/>
           </w:tcPr>
           <w:p>
-            <w:pPr>
-              <w:spacing w:before="60" w:after="60"/>
-              <w:rPr>
-                <w:rFonts w:cs="Arial"/>
-                <w:szCs w:val="22"/>
-                <w:lang w:val="en-US"/>
-              </w:rPr>
-            </w:pPr>
+            <w:r>
+              <w:t>Perth 406</w:t>
+            </w:r>
           </w:p>
         </w:tc>
       </w:tr>
@@ -2839,7 +2812,6 @@
             <w:r>
               <w:t>Week 1: Introduction to AI, ML, and DL</w:t>
             </w:r>
-            <w:r/>
           </w:p>
           <w:p>
             <w:pPr>
@@ -2848,8 +2820,6 @@
             <w:r>
               <w:t>Overview and history of AI, ML, and DL.</w:t>
             </w:r>
-            <w:r/>
-            <w:r/>
           </w:p>
           <w:p>
             <w:pPr>
@@ -2858,8 +2828,6 @@
             <w:r>
               <w:t>Key features and functions of AI technologies.</w:t>
             </w:r>
-            <w:r/>
-            <w:r/>
           </w:p>
           <w:p>
             <w:pPr>
@@ -2868,8 +2836,6 @@
             <w:r>
               <w:t>Functions and features of industry-recognised AI, ML and DL technologies used in organisations.</w:t>
             </w:r>
-            <w:r/>
-            <w:r/>
           </w:p>
           <w:p>
             <w:pPr>
@@ -2878,8 +2844,6 @@
             <w:r>
               <w:t>Discussion of tasks and processes commonly automated using AI, ML, and DL</w:t>
             </w:r>
-            <w:r/>
-            <w:r/>
           </w:p>
           <w:p>
             <w:pPr>
@@ -2888,19 +2852,10 @@
             <w:r>
               <w:t>Explore advantages and disadvantages of AI, ML, and DL technologies.</w:t>
             </w:r>
-            <w:r/>
-          </w:p>
-          <w:p>
-            <w:r/>
-            <w:r>
-              <w:t xml:space="preserve">  </w:t>
-            </w:r>
-            <w:r/>
-          </w:p>
-          <w:p>
-            <w:r>
-              <w:rPr>
-                <w:b w:val="0"/>
+          </w:p>
+          <w:p>
+            <w:r>
+              <w:rPr>
                 <w:i/>
               </w:rPr>
               <w:t>In-class Research Activity</w:t>
@@ -2927,69 +2882,46 @@
                 <w:szCs w:val="20"/>
               </w:rPr>
             </w:pPr>
-            <w:r/>
-            <w:r/>
-            <w:hyperlink r:id="rId26">
+          </w:p>
+          <w:p>
+            <w:hyperlink r:id="rId26" w:history="1">
               <w:r>
                 <w:rPr>
-                  <w:color w:val="0000EE"/>
+                  <w:color w:val="0000FF"/>
                   <w:u w:val="single"/>
                 </w:rPr>
                 <w:t>The Pattern on the Stone, by Danny Hillis</w:t>
               </w:r>
             </w:hyperlink>
-            <w:r>
-              <w:br/>
-            </w:r>
-            <w:r/>
-            <w:r/>
-            <w:r/>
-            <w:hyperlink r:id="rId27">
+            <w:hyperlink r:id="rId27" w:history="1">
               <w:r>
                 <w:rPr>
-                  <w:color w:val="0000EE"/>
+                  <w:color w:val="0000FF"/>
                   <w:u w:val="single"/>
                 </w:rPr>
                 <w:t>The moment we stopped understanding AI [AlexNet]</w:t>
               </w:r>
             </w:hyperlink>
-            <w:r>
-              <w:br/>
-            </w:r>
-            <w:r/>
-            <w:r/>
-            <w:r/>
-            <w:hyperlink r:id="rId28">
+            <w:hyperlink r:id="rId28" w:history="1">
               <w:r>
                 <w:rPr>
-                  <w:color w:val="0000EE"/>
+                  <w:color w:val="0000FF"/>
                   <w:u w:val="single"/>
                 </w:rPr>
                 <w:t>Can machines think?</w:t>
               </w:r>
             </w:hyperlink>
-            <w:r>
-              <w:br/>
-            </w:r>
-            <w:r/>
-          </w:p>
-          <w:p>
-            <w:r/>
-            <w:r/>
-            <w:r/>
-            <w:hyperlink r:id="rId29">
+          </w:p>
+          <w:p>
+            <w:hyperlink r:id="rId29" w:history="1">
               <w:r>
                 <w:rPr>
-                  <w:color w:val="0000EE"/>
+                  <w:color w:val="0000FF"/>
                   <w:u w:val="single"/>
                 </w:rPr>
-                <w:t/>
+                <w:t>https://course.fast.ai/</w:t>
               </w:r>
             </w:hyperlink>
-            <w:r>
-              <w:br/>
-            </w:r>
-            <w:r/>
           </w:p>
         </w:tc>
         <w:tc>
@@ -3016,29 +2948,23 @@
               <w:t>This week's extension reading is:</w:t>
             </w:r>
             <w:r/>
-            <w:r/>
-          </w:p>
-          <w:p>
             <w:r>
               <w:rPr>
                 <w:b/>
-                <w:i w:val="0"/>
               </w:rPr>
               <w:t>"The Moon is a Harsh Mistress" by Robert A. Heinlein</w:t>
             </w:r>
             <w:r>
               <w:t xml:space="preserve"> (1966)</w:t>
             </w:r>
-            <w:r/>
-          </w:p>
-          <w:p>
-            <w:pPr>
-              <w:pStyle w:val="ListBullet2"/>
+          </w:p>
+          <w:p>
+            <w:pPr>
+              <w:pStyle w:val="ListBullet"/>
             </w:pPr>
             <w:r>
               <w:t>A lunar colony's AI, named Mike, gains self-awareness and aids in a revolution against Earth's government, highlighting themes of AI autonomy and human-machine relationships.</w:t>
             </w:r>
-            <w:r/>
           </w:p>
         </w:tc>
         <w:tc>
@@ -3230,7 +3156,6 @@
             <w:r>
               <w:t>Week 2: Data for Machine Learning</w:t>
             </w:r>
-            <w:r/>
           </w:p>
           <w:p>
             <w:pPr>
@@ -3239,8 +3164,6 @@
             <w:r>
               <w:t>Introduction to IPython Environment and Kaggle.</w:t>
             </w:r>
-            <w:r/>
-            <w:r/>
           </w:p>
           <w:p>
             <w:pPr>
@@ -3249,8 +3172,6 @@
             <w:r>
               <w:t>Identifying key data sources for machine learning</w:t>
             </w:r>
-            <w:r/>
-            <w:r/>
           </w:p>
           <w:p>
             <w:pPr>
@@ -3259,8 +3180,6 @@
             <w:r>
               <w:t>Types of data: Structured, Unstructured, Labelled, and Unlabelled.</w:t>
             </w:r>
-            <w:r/>
-            <w:r/>
           </w:p>
           <w:p>
             <w:pPr>
@@ -3269,38 +3188,30 @@
             <w:r>
               <w:t>Understanding ML Attributes:</w:t>
             </w:r>
-            <w:r/>
-            <w:r/>
-          </w:p>
-          <w:p>
-            <w:pPr>
-              <w:pStyle w:val="ListBullet2"/>
+          </w:p>
+          <w:p>
+            <w:pPr>
+              <w:pStyle w:val="ListBullet"/>
             </w:pPr>
             <w:r>
               <w:t>Data Attributes</w:t>
             </w:r>
-            <w:r/>
-            <w:r/>
-          </w:p>
-          <w:p>
-            <w:pPr>
-              <w:pStyle w:val="ListBullet2"/>
+          </w:p>
+          <w:p>
+            <w:pPr>
+              <w:pStyle w:val="ListBullet"/>
             </w:pPr>
             <w:r>
               <w:t>Model Attributes</w:t>
             </w:r>
-            <w:r/>
-            <w:r/>
-          </w:p>
-          <w:p>
-            <w:pPr>
-              <w:pStyle w:val="ListBullet2"/>
+          </w:p>
+          <w:p>
+            <w:pPr>
+              <w:pStyle w:val="ListBullet"/>
             </w:pPr>
             <w:r>
               <w:t>Target Attributes</w:t>
             </w:r>
-            <w:r/>
-            <w:r/>
           </w:p>
           <w:p>
             <w:pPr>
@@ -3309,8 +3220,6 @@
             <w:r>
               <w:t>Understanding relevant algorithms for labelled or unlabeled datasets.</w:t>
             </w:r>
-            <w:r/>
-            <w:r/>
           </w:p>
           <w:p>
             <w:pPr>
@@ -3319,8 +3228,6 @@
             <w:r>
               <w:t>Understand biases in datasets and methods for generating balanced data.</w:t>
             </w:r>
-            <w:r/>
-            <w:r/>
           </w:p>
           <w:p>
             <w:pPr>
@@ -3329,60 +3236,42 @@
             <w:r>
               <w:t>Intro to data pre-processing for ML:</w:t>
             </w:r>
-            <w:r/>
-            <w:r/>
-          </w:p>
-          <w:p>
-            <w:pPr>
-              <w:pStyle w:val="ListBullet2"/>
+          </w:p>
+          <w:p>
+            <w:pPr>
+              <w:pStyle w:val="ListBullet"/>
             </w:pPr>
             <w:r>
               <w:t>Randomising, deduplication</w:t>
             </w:r>
-            <w:r/>
-            <w:r/>
-          </w:p>
-          <w:p>
-            <w:pPr>
-              <w:pStyle w:val="ListBullet2"/>
+          </w:p>
+          <w:p>
+            <w:pPr>
+              <w:pStyle w:val="ListBullet"/>
             </w:pPr>
             <w:r>
               <w:t>Data cleaning</w:t>
             </w:r>
-            <w:r/>
-            <w:r/>
-          </w:p>
-          <w:p>
-            <w:pPr>
-              <w:pStyle w:val="ListBullet2"/>
+          </w:p>
+          <w:p>
+            <w:pPr>
+              <w:pStyle w:val="ListBullet"/>
             </w:pPr>
             <w:r>
               <w:t>Creating training, validation, and test subsets, why?</w:t>
             </w:r>
-            <w:r/>
-            <w:r/>
-          </w:p>
-          <w:p>
-            <w:pPr>
-              <w:pStyle w:val="ListBullet2"/>
+          </w:p>
+          <w:p>
+            <w:pPr>
+              <w:pStyle w:val="ListBullet"/>
             </w:pPr>
             <w:r>
               <w:t>Training, Test, and Validation Loops (Preview Topic)</w:t>
             </w:r>
-            <w:r/>
-          </w:p>
-          <w:p>
-            <w:r/>
-          </w:p>
-          <w:p>
-            <w:r/>
-            <w:r/>
-            <w:r/>
-          </w:p>
-          <w:p>
-            <w:r>
-              <w:rPr>
-                <w:b w:val="0"/>
+          </w:p>
+          <w:p>
+            <w:r>
+              <w:rPr>
                 <w:i/>
               </w:rPr>
               <w:t>In-class Activity</w:t>
@@ -3409,21 +3298,17 @@
                 <w:szCs w:val="20"/>
               </w:rPr>
             </w:pPr>
-            <w:r/>
-            <w:r/>
-            <w:hyperlink r:id="rId30">
+          </w:p>
+          <w:p>
+            <w:hyperlink r:id="rId30" w:history="1">
               <w:r>
                 <w:rPr>
-                  <w:color w:val="0000EE"/>
+                  <w:color w:val="0000FF"/>
                   <w:u w:val="single"/>
                 </w:rPr>
                 <w:t>Data Attributes and Model Attributes</w:t>
               </w:r>
             </w:hyperlink>
-            <w:r>
-              <w:br/>
-            </w:r>
-            <w:r/>
           </w:p>
         </w:tc>
         <w:tc>
@@ -3450,29 +3335,23 @@
               <w:t>This week's extension reading is:</w:t>
             </w:r>
             <w:r/>
-            <w:r/>
-          </w:p>
-          <w:p>
             <w:r>
               <w:rPr>
                 <w:b/>
-                <w:i w:val="0"/>
               </w:rPr>
               <w:t>"Reason" by Isaac Asimov</w:t>
             </w:r>
             <w:r>
               <w:t xml:space="preserve"> (1941)</w:t>
             </w:r>
-            <w:r/>
-          </w:p>
-          <w:p>
-            <w:pPr>
-              <w:pStyle w:val="ListBullet2"/>
+          </w:p>
+          <w:p>
+            <w:pPr>
+              <w:pStyle w:val="ListBullet"/>
             </w:pPr>
             <w:r>
               <w:t>Isaac Asimov's "Reason" depicts a robot named QT-1 who questions human authority and develops its own belief system based on logic and reason.</w:t>
             </w:r>
-            <w:r/>
           </w:p>
         </w:tc>
         <w:tc>
@@ -3654,7 +3533,6 @@
             <w:r>
               <w:t>Week 3: Essentials of ML and DL Technologies</w:t>
             </w:r>
-            <w:r/>
           </w:p>
           <w:p>
             <w:pPr>
@@ -3663,18 +3541,14 @@
             <w:r>
               <w:t>Introduction to sci-kit learn package</w:t>
             </w:r>
-            <w:r/>
-            <w:r/>
           </w:p>
           <w:p>
             <w:pPr>
               <w:pStyle w:val="ListBullet"/>
             </w:pPr>
             <w:r>
-              <w:t xml:space="preserve">Understanding ML: Supervised vs. Unsupervised Learning </w:t>
-            </w:r>
-            <w:r/>
-            <w:r/>
+              <w:t>Understanding ML: Supervised vs. Unsupervised Learning</w:t>
+            </w:r>
           </w:p>
           <w:p>
             <w:pPr>
@@ -3683,8 +3557,6 @@
             <w:r>
               <w:t>Introduction to DL and its place within AI</w:t>
             </w:r>
-            <w:r/>
-            <w:r/>
           </w:p>
           <w:p>
             <w:pPr>
@@ -3693,50 +3565,40 @@
             <w:r>
               <w:t>Regression &amp; Classification — Supervised</w:t>
             </w:r>
-            <w:r/>
-            <w:r/>
-          </w:p>
-          <w:p>
-            <w:pPr>
-              <w:pStyle w:val="ListBullet2"/>
+          </w:p>
+          <w:p>
+            <w:pPr>
+              <w:pStyle w:val="ListBullet"/>
             </w:pPr>
             <w:r>
               <w:t>Linear Regression, Support Vector Machines</w:t>
             </w:r>
-            <w:r/>
-            <w:r/>
           </w:p>
           <w:p>
             <w:pPr>
               <w:pStyle w:val="ListBullet"/>
             </w:pPr>
             <w:r>
-              <w:t xml:space="preserve">Clustering &amp; Dimensionality — Unsupervised </w:t>
-            </w:r>
-            <w:r/>
-            <w:r/>
-          </w:p>
-          <w:p>
-            <w:pPr>
-              <w:pStyle w:val="ListBullet2"/>
+              <w:t>Clustering &amp; Dimensionality — Unsupervised</w:t>
+            </w:r>
+          </w:p>
+          <w:p>
+            <w:pPr>
+              <w:pStyle w:val="ListBullet"/>
             </w:pPr>
             <w:r>
               <w:t>PCA &amp; Other</w:t>
               <w:tab/>
               <w:t>Dimensionality Reduction Techniques</w:t>
             </w:r>
-            <w:r/>
-            <w:r/>
-          </w:p>
-          <w:p>
-            <w:pPr>
-              <w:pStyle w:val="ListBullet2"/>
+          </w:p>
+          <w:p>
+            <w:pPr>
+              <w:pStyle w:val="ListBullet"/>
             </w:pPr>
             <w:r>
               <w:t>Introduction to K-Means clustering &amp; DBSCAN</w:t>
             </w:r>
-            <w:r/>
-            <w:r/>
           </w:p>
           <w:p>
             <w:pPr>
@@ -3745,8 +3607,6 @@
             <w:r>
               <w:t>Reinforcement Learning / Reward-based learning.</w:t>
             </w:r>
-            <w:r/>
-            <w:r/>
           </w:p>
           <w:p>
             <w:pPr>
@@ -3755,47 +3615,34 @@
             <w:r>
               <w:t>Deep Learning / Representation learning</w:t>
             </w:r>
-            <w:r/>
-            <w:r/>
-          </w:p>
-          <w:p>
-            <w:pPr>
-              <w:pStyle w:val="ListBullet2"/>
+          </w:p>
+          <w:p>
+            <w:pPr>
+              <w:pStyle w:val="ListBullet"/>
             </w:pPr>
             <w:r>
               <w:t>Feed Forward Neural Networks (FNN)</w:t>
             </w:r>
-            <w:r/>
-            <w:r/>
-          </w:p>
-          <w:p>
-            <w:pPr>
-              <w:pStyle w:val="ListBullet2"/>
+          </w:p>
+          <w:p>
+            <w:pPr>
+              <w:pStyle w:val="ListBullet"/>
             </w:pPr>
             <w:r>
               <w:t>Recurrent Neural Networks (RNN)</w:t>
             </w:r>
-            <w:r/>
-            <w:r/>
-          </w:p>
-          <w:p>
-            <w:pPr>
-              <w:pStyle w:val="ListBullet2"/>
+          </w:p>
+          <w:p>
+            <w:pPr>
+              <w:pStyle w:val="ListBullet"/>
             </w:pPr>
             <w:r>
               <w:t>Transformers (Attention based Networks)</w:t>
             </w:r>
-            <w:r/>
-          </w:p>
-          <w:p>
-            <w:r/>
-            <w:r/>
-            <w:r/>
-          </w:p>
-          <w:p>
-            <w:r>
-              <w:rPr>
-                <w:b w:val="0"/>
+          </w:p>
+          <w:p>
+            <w:r>
+              <w:rPr>
                 <w:i/>
               </w:rPr>
               <w:t>Lab activity</w:t>
@@ -3822,9 +3669,6 @@
                 <w:szCs w:val="20"/>
               </w:rPr>
             </w:pPr>
-          </w:p>
-          <w:p>
-            <w:r/>
           </w:p>
         </w:tc>
         <w:tc>
@@ -3851,29 +3695,23 @@
               <w:t>This week's extension reading is:</w:t>
             </w:r>
             <w:r/>
-            <w:r/>
-          </w:p>
-          <w:p>
             <w:r>
               <w:rPr>
                 <w:b/>
-                <w:i w:val="0"/>
               </w:rPr>
               <w:t>"Robbie" by Isaac Asimov</w:t>
             </w:r>
             <w:r>
               <w:t xml:space="preserve"> (1940)</w:t>
             </w:r>
-            <w:r/>
-          </w:p>
-          <w:p>
-            <w:pPr>
-              <w:pStyle w:val="ListBullet2"/>
+          </w:p>
+          <w:p>
+            <w:pPr>
+              <w:pStyle w:val="ListBullet"/>
             </w:pPr>
             <w:r>
               <w:t>Isaac Asimov's "Robbie" tells the story of a young girl who forms a deep bond with her humanoid robot companion, highlighting themes of friendship, prejudice, and the ethical implications of robotic intelligence.</w:t>
             </w:r>
-            <w:r/>
           </w:p>
         </w:tc>
         <w:tc>
@@ -4024,7 +3862,6 @@
             <w:r>
               <w:t>Week 4: Data Bias and Ethics in AI</w:t>
             </w:r>
-            <w:r/>
           </w:p>
           <w:p>
             <w:pPr>
@@ -4033,8 +3870,6 @@
             <w:r>
               <w:t>Recognising biased vs. unbiased datasets</w:t>
             </w:r>
-            <w:r/>
-            <w:r/>
           </w:p>
           <w:p>
             <w:pPr>
@@ -4043,8 +3878,6 @@
             <w:r>
               <w:t>Implementation Risks</w:t>
             </w:r>
-            <w:r/>
-            <w:r/>
           </w:p>
           <w:p>
             <w:pPr>
@@ -4053,22 +3886,14 @@
             <w:r>
               <w:t>Ethics in AI, including Australia’s AI Ethics Framework</w:t>
             </w:r>
-            <w:r/>
-          </w:p>
-          <w:p>
-            <w:r/>
-            <w:r/>
-            <w:r/>
-          </w:p>
-          <w:p>
-            <w:r>
-              <w:rPr>
-                <w:b w:val="0"/>
+          </w:p>
+          <w:p>
+            <w:r>
+              <w:rPr>
                 <w:i/>
               </w:rPr>
               <w:t>Discussion-based Learning Session</w:t>
             </w:r>
-            <w:r/>
           </w:p>
         </w:tc>
         <w:tc>
@@ -4095,83 +3920,52 @@
             </w:r>
           </w:p>
           <w:p>
-            <w:r/>
-            <w:r/>
-            <w:r/>
-            <w:hyperlink r:id="rId31">
+            <w:hyperlink r:id="rId31" w:history="1">
               <w:r>
                 <w:rPr>
-                  <w:color w:val="0000EE"/>
+                  <w:color w:val="0000FF"/>
                   <w:u w:val="single"/>
                 </w:rPr>
                 <w:t>AI Assurance Framework</w:t>
               </w:r>
             </w:hyperlink>
-            <w:r>
-              <w:br/>
-            </w:r>
-            <w:r/>
-            <w:r/>
-            <w:r/>
-            <w:hyperlink r:id="rId32">
+            <w:hyperlink r:id="rId32" w:history="1">
               <w:r>
                 <w:rPr>
-                  <w:color w:val="0000EE"/>
+                  <w:color w:val="0000FF"/>
                   <w:u w:val="single"/>
                 </w:rPr>
                 <w:t>Artificial Intelligence Policy</w:t>
               </w:r>
             </w:hyperlink>
             <w:r>
-              <w:br/>
-            </w:r>
-            <w:r/>
-          </w:p>
-          <w:p>
-            <w:r>
               <w:t>National:</w:t>
             </w:r>
           </w:p>
           <w:p>
-            <w:r/>
-            <w:r/>
-            <w:r/>
-            <w:hyperlink r:id="rId33">
+            <w:hyperlink r:id="rId33" w:history="1">
               <w:r>
                 <w:rPr>
-                  <w:color w:val="0000EE"/>
+                  <w:color w:val="0000FF"/>
                   <w:u w:val="single"/>
                 </w:rPr>
                 <w:t>Australia’s Artificial Intelligence Ethics Framework</w:t>
               </w:r>
             </w:hyperlink>
             <w:r>
-              <w:br/>
-            </w:r>
-            <w:r/>
-          </w:p>
-          <w:p>
-            <w:r>
               <w:t>Out of state:</w:t>
             </w:r>
           </w:p>
           <w:p>
-            <w:r/>
-            <w:r/>
-            <w:r/>
-            <w:hyperlink r:id="rId34">
+            <w:hyperlink r:id="rId34" w:history="1">
               <w:r>
                 <w:rPr>
-                  <w:color w:val="0000EE"/>
+                  <w:color w:val="0000FF"/>
                   <w:u w:val="single"/>
                 </w:rPr>
                 <w:t>Artificial Intelligence Ethics Policy</w:t>
               </w:r>
             </w:hyperlink>
-            <w:r>
-              <w:br/>
-            </w:r>
-            <w:r/>
           </w:p>
         </w:tc>
         <w:tc>
@@ -4198,29 +3992,23 @@
               <w:t>This week's extension reading is:</w:t>
             </w:r>
             <w:r/>
-            <w:r/>
-          </w:p>
-          <w:p>
             <w:r>
               <w:rPr>
                 <w:b/>
-                <w:i w:val="0"/>
               </w:rPr>
               <w:t>"I Have No Mouth, and I Must Scream" by Harlan Ellison</w:t>
             </w:r>
             <w:r>
               <w:t xml:space="preserve"> (1968)</w:t>
             </w:r>
-            <w:r/>
-          </w:p>
-          <w:p>
-            <w:pPr>
-              <w:pStyle w:val="ListBullet2"/>
+          </w:p>
+          <w:p>
+            <w:pPr>
+              <w:pStyle w:val="ListBullet"/>
             </w:pPr>
             <w:r>
               <w:t>A harrowing short story about a supercomputer AI that has annihilated humanity, except for five individuals it tortures, is an intense and profound exploration of AI's potential for cruelty.</w:t>
             </w:r>
-            <w:r/>
           </w:p>
         </w:tc>
         <w:tc>
@@ -4395,84 +4183,63 @@
             <w:r>
               <w:t>Week 5: Identify an Opportunity for Task Automation</w:t>
             </w:r>
+          </w:p>
+          <w:p>
+            <w:pPr>
+              <w:pStyle w:val="ListBullet"/>
+            </w:pPr>
+            <w:r>
+              <w:t>Establishing organisational AI, ML and DL objectives</w:t>
+            </w:r>
+          </w:p>
+          <w:p>
+            <w:pPr>
+              <w:pStyle w:val="ListBullet"/>
+            </w:pPr>
+            <w:r>
+              <w:t>Identifying existing organisational AI technologies and processes</w:t>
+            </w:r>
+          </w:p>
+          <w:p>
+            <w:pPr>
+              <w:pStyle w:val="ListBullet"/>
+            </w:pPr>
+            <w:r>
+              <w:t>Identifying common tasks/processes for automation</w:t>
+            </w:r>
+          </w:p>
+          <w:p>
+            <w:pPr>
+              <w:pStyle w:val="ListBullet"/>
+            </w:pPr>
+            <w:r>
+              <w:t>Examples of AI in email campaigns, chatbots, data analysis</w:t>
+            </w:r>
+          </w:p>
+          <w:p>
+            <w:pPr>
+              <w:pStyle w:val="ListBullet"/>
+            </w:pPr>
+            <w:r>
+              <w:t>Introduction to the Final Project.</w:t>
+            </w:r>
+          </w:p>
+          <w:p>
+            <w:r>
+              <w:rPr>
+                <w:i/>
+              </w:rPr>
+              <w:t>Students to complete Task 1</w:t>
+            </w:r>
+            <w:r>
+              <w:t>: Identify an Opportunity for Task Automation of AT1 in-class.</w:t>
+            </w:r>
+          </w:p>
+          <w:p>
             <w:r/>
-          </w:p>
-          <w:p>
-            <w:pPr>
-              <w:pStyle w:val="ListBullet"/>
-            </w:pPr>
-            <w:r>
-              <w:t>Establishing organisational AI, ML and DL objectives</w:t>
-            </w:r>
-            <w:r/>
-            <w:r/>
-          </w:p>
-          <w:p>
-            <w:pPr>
-              <w:pStyle w:val="ListBullet"/>
-            </w:pPr>
-            <w:r>
-              <w:t>Identifying existing organisational AI technologies and processes</w:t>
-            </w:r>
-            <w:r/>
-            <w:r/>
-          </w:p>
-          <w:p>
-            <w:pPr>
-              <w:pStyle w:val="ListBullet"/>
-            </w:pPr>
-            <w:r>
-              <w:t xml:space="preserve">Identifying common tasks/processes for automation </w:t>
-            </w:r>
-            <w:r/>
-            <w:r/>
-          </w:p>
-          <w:p>
-            <w:pPr>
-              <w:pStyle w:val="ListBullet"/>
-            </w:pPr>
-            <w:r>
-              <w:t>Examples of AI in email campaigns, chatbots, data analysis</w:t>
-            </w:r>
-            <w:r/>
-            <w:r/>
-          </w:p>
-          <w:p>
-            <w:pPr>
-              <w:pStyle w:val="ListBullet"/>
-            </w:pPr>
-            <w:r>
-              <w:t>Introduction to the Final Project.</w:t>
-            </w:r>
-            <w:r/>
-          </w:p>
-          <w:p>
-            <w:r/>
-            <w:r/>
-            <w:r/>
-          </w:p>
-          <w:p>
-            <w:r>
-              <w:rPr>
-                <w:b w:val="0"/>
-                <w:i/>
-              </w:rPr>
-              <w:t>Students to complete Task 1</w:t>
-            </w:r>
-            <w:r>
-              <w:t>: Identify an Opportunity for Task Automation of AT1 in-class.</w:t>
-            </w:r>
-          </w:p>
-          <w:p>
-            <w:r/>
-            <w:r/>
-            <w:r/>
-          </w:p>
-          <w:p>
             <w:r>
               <w:rPr>
                 <w:b/>
-                <w:i w:val="0"/>
               </w:rPr>
               <w:t>Assessment 1 Start</w:t>
             </w:r>
@@ -4496,9 +4263,6 @@
                 <w:szCs w:val="20"/>
               </w:rPr>
             </w:pPr>
-          </w:p>
-          <w:p>
-            <w:r/>
           </w:p>
         </w:tc>
         <w:tc>
@@ -4681,17 +4445,14 @@
             <w:r>
               <w:t>Week 6: Evaluating ML Opportunities</w:t>
             </w:r>
-            <w:r/>
           </w:p>
           <w:p>
             <w:pPr>
               <w:pStyle w:val="ListBullet"/>
             </w:pPr>
             <w:r>
-              <w:t xml:space="preserve">Identifying and documenting ML opportunities </w:t>
-            </w:r>
-            <w:r/>
-            <w:r/>
+              <w:t>Identifying and documenting ML opportunities</w:t>
+            </w:r>
           </w:p>
           <w:p>
             <w:pPr>
@@ -4700,8 +4461,6 @@
             <w:r>
               <w:t>Evaluation and comparison of AI, ML, and DL technologies</w:t>
             </w:r>
-            <w:r/>
-            <w:r/>
           </w:p>
           <w:p>
             <w:pPr>
@@ -4710,8 +4469,6 @@
             <w:r>
               <w:t>Key advantages and disadvantages of AI, ML and DL technologies</w:t>
             </w:r>
-            <w:r/>
-            <w:r/>
           </w:p>
           <w:p>
             <w:pPr>
@@ -4720,8 +4477,6 @@
             <w:r>
               <w:t>What kinds of datasets are useful for automating work tasks?</w:t>
             </w:r>
-            <w:r/>
-            <w:r/>
           </w:p>
           <w:p>
             <w:pPr>
@@ -4730,22 +4485,14 @@
             <w:r>
               <w:t>Industry-recognised ML principles and techniques.</w:t>
             </w:r>
-            <w:r/>
-          </w:p>
-          <w:p>
-            <w:r/>
-            <w:r/>
-            <w:r/>
-          </w:p>
-          <w:p>
-            <w:r>
-              <w:rPr>
-                <w:b w:val="0"/>
+          </w:p>
+          <w:p>
+            <w:r>
+              <w:rPr>
                 <w:i/>
               </w:rPr>
               <w:t>Students to Complete Task 2 &amp; 3 &amp; 4 of Assessment 1 in class</w:t>
             </w:r>
-            <w:r/>
           </w:p>
         </w:tc>
         <w:tc>
@@ -4765,9 +4512,6 @@
                 <w:szCs w:val="20"/>
               </w:rPr>
             </w:pPr>
-          </w:p>
-          <w:p>
-            <w:r/>
           </w:p>
         </w:tc>
         <w:tc>
@@ -4951,33 +4695,24 @@
             <w:r>
               <w:t>Week 7: Student Presentation Week — Assessment 1</w:t>
             </w:r>
+          </w:p>
+          <w:p>
             <w:r/>
+            <w:r>
+              <w:rPr>
+                <w:b/>
+              </w:rPr>
+              <w:t>Assessment 1 Due</w:t>
+            </w:r>
             <w:r/>
           </w:p>
           <w:p>
             <w:r>
               <w:rPr>
-                <w:b/>
-                <w:i w:val="0"/>
-              </w:rPr>
-              <w:t>Assessment 1 Due</w:t>
-            </w:r>
-            <w:r/>
-          </w:p>
-          <w:p>
-            <w:r/>
-            <w:r/>
-            <w:r/>
-          </w:p>
-          <w:p>
-            <w:r>
-              <w:rPr>
-                <w:b w:val="0"/>
                 <w:i/>
               </w:rPr>
               <w:t>Perform a 5 to 10-minute pitch on a particular opportunity for Automation in AI.</w:t>
             </w:r>
-            <w:r/>
           </w:p>
         </w:tc>
         <w:tc>
@@ -4997,9 +4732,6 @@
                 <w:szCs w:val="20"/>
               </w:rPr>
             </w:pPr>
-          </w:p>
-          <w:p>
-            <w:r/>
           </w:p>
         </w:tc>
         <w:tc>
@@ -5020,30 +4752,26 @@
                 <w:szCs w:val="20"/>
               </w:rPr>
             </w:pPr>
+          </w:p>
+          <w:p>
             <w:r/>
-            <w:r/>
-          </w:p>
-          <w:p>
             <w:r>
               <w:rPr>
                 <w:b/>
-                <w:i w:val="0"/>
               </w:rPr>
               <w:t>"The Secret Place" by Richard McKenna</w:t>
             </w:r>
             <w:r>
               <w:t xml:space="preserve"> (1966)</w:t>
             </w:r>
-            <w:r/>
-          </w:p>
-          <w:p>
-            <w:pPr>
-              <w:pStyle w:val="ListBullet2"/>
+          </w:p>
+          <w:p>
+            <w:pPr>
+              <w:pStyle w:val="ListBullet"/>
             </w:pPr>
             <w:r>
               <w:t>This story follows an AI in a mining colony located on a distant planet, delving into themes of self-discovery and what it means to be sentient.</w:t>
             </w:r>
-            <w:r/>
           </w:p>
         </w:tc>
         <w:tc>
@@ -5187,7 +4915,6 @@
             <w:r>
               <w:t>Week 8: Optimization &amp; Evaluation</w:t>
             </w:r>
-            <w:r/>
           </w:p>
           <w:p>
             <w:pPr>
@@ -5196,8 +4923,6 @@
             <w:r>
               <w:t>Hyper Parameters, What are they?</w:t>
             </w:r>
-            <w:r/>
-            <w:r/>
           </w:p>
           <w:p>
             <w:pPr>
@@ -5206,8 +4931,6 @@
             <w:r>
               <w:t>Model Output Evaluation Methods</w:t>
             </w:r>
-            <w:r/>
-            <w:r/>
           </w:p>
           <w:p>
             <w:pPr>
@@ -5216,8 +4939,6 @@
             <w:r>
               <w:t>Documenting ML model Evaluations</w:t>
             </w:r>
-            <w:r/>
-            <w:r/>
           </w:p>
           <w:p>
             <w:pPr>
@@ -5226,103 +4947,75 @@
             <w:r>
               <w:t>Evaluation metrics:</w:t>
             </w:r>
-            <w:r/>
-            <w:r/>
-          </w:p>
-          <w:p>
-            <w:pPr>
-              <w:pStyle w:val="ListBullet2"/>
+          </w:p>
+          <w:p>
+            <w:pPr>
+              <w:pStyle w:val="ListBullet"/>
             </w:pPr>
             <w:r>
               <w:t>f-score</w:t>
             </w:r>
-            <w:r/>
-            <w:r/>
-          </w:p>
-          <w:p>
-            <w:pPr>
-              <w:pStyle w:val="ListBullet2"/>
+          </w:p>
+          <w:p>
+            <w:pPr>
+              <w:pStyle w:val="ListBullet"/>
             </w:pPr>
             <w:r>
               <w:t>accuracy</w:t>
             </w:r>
-            <w:r/>
-            <w:r/>
-          </w:p>
-          <w:p>
-            <w:pPr>
-              <w:pStyle w:val="ListBullet2"/>
+          </w:p>
+          <w:p>
+            <w:pPr>
+              <w:pStyle w:val="ListBullet"/>
             </w:pPr>
             <w:r>
               <w:t>precision/recall</w:t>
             </w:r>
-            <w:r/>
-            <w:r/>
-          </w:p>
-          <w:p>
-            <w:pPr>
-              <w:pStyle w:val="ListBullet2"/>
+          </w:p>
+          <w:p>
+            <w:pPr>
+              <w:pStyle w:val="ListBullet"/>
             </w:pPr>
             <w:r>
               <w:t>loss metrics</w:t>
             </w:r>
-            <w:r/>
-            <w:r/>
-          </w:p>
-          <w:p>
-            <w:pPr>
-              <w:pStyle w:val="ListBullet2"/>
+          </w:p>
+          <w:p>
+            <w:pPr>
+              <w:pStyle w:val="ListBullet"/>
             </w:pPr>
             <w:r>
               <w:t>confusion matrix</w:t>
             </w:r>
-            <w:r/>
-          </w:p>
-          <w:p>
-            <w:r/>
           </w:p>
           <w:p>
             <w:r>
               <w:t>Preview for next session (Main Concepts):</w:t>
             </w:r>
-            <w:r/>
-          </w:p>
-          <w:p>
-            <w:pPr>
-              <w:pStyle w:val="ListBullet2"/>
+          </w:p>
+          <w:p>
+            <w:pPr>
+              <w:pStyle w:val="ListBullet"/>
             </w:pPr>
             <w:r>
               <w:t>Backpropagation of the Loss</w:t>
             </w:r>
-            <w:r/>
-            <w:r/>
-          </w:p>
-          <w:p>
-            <w:pPr>
-              <w:pStyle w:val="ListBullet2"/>
+          </w:p>
+          <w:p>
+            <w:pPr>
+              <w:pStyle w:val="ListBullet"/>
             </w:pPr>
             <w:r>
               <w:t>Stochastic Gradient Descent</w:t>
             </w:r>
-            <w:r/>
-          </w:p>
-          <w:p>
-            <w:r/>
-          </w:p>
-          <w:p>
-            <w:r/>
-            <w:r/>
-            <w:r/>
-          </w:p>
-          <w:p>
-            <w:r>
-              <w:rPr>
-                <w:b w:val="0"/>
+          </w:p>
+          <w:p>
+            <w:r>
+              <w:rPr>
                 <w:i/>
               </w:rPr>
               <w:t>Lab: Let’s apply grid search to optimize an email spam filter.</w:t>
             </w:r>
-            <w:r/>
           </w:p>
         </w:tc>
         <w:tc>
@@ -5349,80 +5042,50 @@
             </w:r>
           </w:p>
           <w:p>
-            <w:r/>
-            <w:r/>
-            <w:r/>
-            <w:hyperlink r:id="rId35">
+            <w:hyperlink r:id="rId35" w:history="1">
               <w:r>
                 <w:rPr>
-                  <w:color w:val="0000EE"/>
+                  <w:color w:val="0000FF"/>
                   <w:u w:val="single"/>
                 </w:rPr>
                 <w:t>Confusion matrix Stat Quest</w:t>
               </w:r>
             </w:hyperlink>
-            <w:r>
-              <w:br/>
-            </w:r>
-            <w:r/>
-            <w:r/>
-            <w:r/>
-            <w:hyperlink r:id="rId36">
+            <w:hyperlink r:id="rId36" w:history="1">
               <w:r>
                 <w:rPr>
-                  <w:color w:val="0000EE"/>
+                  <w:color w:val="0000FF"/>
                   <w:u w:val="single"/>
                 </w:rPr>
                 <w:t>Cross-Validation</w:t>
               </w:r>
             </w:hyperlink>
             <w:r>
-              <w:br/>
-            </w:r>
-            <w:r/>
-          </w:p>
-          <w:p>
-            <w:r>
               <w:t>Deep Learning Preview</w:t>
             </w:r>
-          </w:p>
-          <w:p>
             <w:r>
               <w:t>3b1b videos watch in-class:</w:t>
             </w:r>
           </w:p>
           <w:p>
-            <w:r/>
-            <w:r/>
-            <w:r/>
-            <w:hyperlink r:id="rId37">
+            <w:hyperlink r:id="rId37" w:history="1">
               <w:r>
                 <w:rPr>
-                  <w:color w:val="0000EE"/>
+                  <w:color w:val="0000FF"/>
                   <w:u w:val="single"/>
                 </w:rPr>
                 <w:t>Gradient descent, how neural networks learn</w:t>
               </w:r>
             </w:hyperlink>
-            <w:r>
-              <w:br/>
-            </w:r>
-            <w:r/>
-            <w:r/>
-            <w:r/>
-            <w:hyperlink r:id="rId38">
+            <w:hyperlink r:id="rId38" w:history="1">
               <w:r>
                 <w:rPr>
-                  <w:color w:val="0000EE"/>
+                  <w:color w:val="0000FF"/>
                   <w:u w:val="single"/>
                 </w:rPr>
                 <w:t>Backpropagation</w:t>
               </w:r>
             </w:hyperlink>
-            <w:r>
-              <w:br/>
-            </w:r>
-            <w:r/>
           </w:p>
         </w:tc>
         <w:tc>
@@ -5443,71 +5106,51 @@
                 <w:szCs w:val="20"/>
               </w:rPr>
             </w:pPr>
+          </w:p>
+          <w:p>
             <w:r/>
-            <w:r/>
-          </w:p>
-          <w:p>
             <w:r>
               <w:rPr>
                 <w:b/>
-                <w:i w:val="0"/>
               </w:rPr>
               <w:t>"The Algorithms for Love" by Ken Liu</w:t>
             </w:r>
             <w:r>
               <w:t xml:space="preserve"> (2004)</w:t>
             </w:r>
-            <w:r/>
-          </w:p>
-          <w:p>
-            <w:pPr>
-              <w:pStyle w:val="ListBullet2"/>
+          </w:p>
+          <w:p>
+            <w:pPr>
+              <w:pStyle w:val="ListBullet"/>
             </w:pPr>
             <w:r>
               <w:t>This story gives a deep look into AI and love, making it a valuable addition for discussions on AI emotions and ethics.</w:t>
             </w:r>
-            <w:r/>
-          </w:p>
-          <w:p>
-            <w:r/>
-          </w:p>
-          <w:p>
-            <w:r>
-              <w:t xml:space="preserve">Look at the 3Blue1Brown course: </w:t>
-            </w:r>
-          </w:p>
-          <w:p>
-            <w:r/>
-            <w:r/>
-            <w:r/>
-            <w:hyperlink r:id="rId39">
+          </w:p>
+          <w:p>
+            <w:r>
+              <w:t>Look at the 3Blue1Brown course:</w:t>
+            </w:r>
+          </w:p>
+          <w:p>
+            <w:hyperlink r:id="rId39" w:history="1">
               <w:r>
                 <w:rPr>
-                  <w:color w:val="0000EE"/>
+                  <w:color w:val="0000FF"/>
                   <w:u w:val="single"/>
                 </w:rPr>
                 <w:t>Youtube Course</w:t>
               </w:r>
             </w:hyperlink>
-            <w:r>
-              <w:br/>
-            </w:r>
-            <w:r/>
-            <w:r/>
-            <w:r/>
-            <w:hyperlink r:id="rId40">
+            <w:hyperlink r:id="rId40" w:history="1">
               <w:r>
                 <w:rPr>
-                  <w:color w:val="0000EE"/>
+                  <w:color w:val="0000FF"/>
                   <w:u w:val="single"/>
                 </w:rPr>
                 <w:t>Interactive course</w:t>
               </w:r>
             </w:hyperlink>
-            <w:r>
-              <w:br/>
-            </w:r>
-            <w:r/>
           </w:p>
         </w:tc>
         <w:tc>
@@ -5668,145 +5311,108 @@
             <w:r>
               <w:t>Week 9: Deep Learning Foundations</w:t>
             </w:r>
+          </w:p>
+          <w:p>
+            <w:pPr>
+              <w:pStyle w:val="ListBullet"/>
+            </w:pPr>
+            <w:r>
+              <w:t>Introduction to Neural Networks</w:t>
+            </w:r>
+          </w:p>
+          <w:p>
+            <w:pPr>
+              <w:pStyle w:val="ListBullet"/>
+            </w:pPr>
+            <w:r>
+              <w:t>What are ‘hidden layers’?</w:t>
+            </w:r>
+          </w:p>
+          <w:p>
+            <w:pPr>
+              <w:pStyle w:val="ListBullet"/>
+            </w:pPr>
+            <w:r>
+              <w:t>How can we teach machines to think good?</w:t>
+            </w:r>
+          </w:p>
+          <w:p>
+            <w:pPr>
+              <w:pStyle w:val="ListBullet"/>
+            </w:pPr>
+            <w:r>
+              <w:t>Training, Test, and Validation Loops for Deep Learning</w:t>
+            </w:r>
+          </w:p>
+          <w:p>
+            <w:pPr>
+              <w:pStyle w:val="ListBullet"/>
+            </w:pPr>
+            <w:r>
+              <w:t>Stochastic Gradient Descent</w:t>
+            </w:r>
+          </w:p>
+          <w:p>
+            <w:pPr>
+              <w:pStyle w:val="ListBullet"/>
+            </w:pPr>
+            <w:r>
+              <w:t>Backpropagation of the Loss</w:t>
+            </w:r>
+          </w:p>
+          <w:p>
+            <w:pPr>
+              <w:pStyle w:val="ListBullet"/>
+            </w:pPr>
+            <w:r>
+              <w:t>Machine Vision</w:t>
+            </w:r>
+          </w:p>
+          <w:p>
+            <w:pPr>
+              <w:pStyle w:val="ListBullet"/>
+            </w:pPr>
+            <w:r>
+              <w:t>Neural network architecture</w:t>
+            </w:r>
+          </w:p>
+          <w:p>
+            <w:pPr>
+              <w:pStyle w:val="ListBullet"/>
+            </w:pPr>
+            <w:r>
+              <w:t>Multilayer Perceptron (MLP) / Feed-Forward Networks / Fully-connected Networks</w:t>
+            </w:r>
+          </w:p>
+          <w:p>
+            <w:pPr>
+              <w:pStyle w:val="ListBullet"/>
+            </w:pPr>
+            <w:r>
+              <w:t>Convolutional Neural Networks (CNN) — What does it do, why might it be better for images?</w:t>
+            </w:r>
+          </w:p>
+          <w:p>
+            <w:pPr>
+              <w:pStyle w:val="ListBullet"/>
+            </w:pPr>
+            <w:r>
+              <w:t>Recurrent Neural Networks — (Stateful networks) Why should we keep track of state?</w:t>
+            </w:r>
+          </w:p>
+          <w:p>
+            <w:r>
+              <w:rPr>
+                <w:i/>
+              </w:rPr>
+              <w:t>Lab: Training a FFN on MNIST in Pytorch</w:t>
+            </w:r>
+          </w:p>
+          <w:p>
             <w:r/>
-          </w:p>
-          <w:p>
-            <w:pPr>
-              <w:pStyle w:val="ListBullet"/>
-            </w:pPr>
-            <w:r>
-              <w:t>Introduction to Neural Networks</w:t>
-            </w:r>
-            <w:r/>
-            <w:r/>
-          </w:p>
-          <w:p>
-            <w:pPr>
-              <w:pStyle w:val="ListBullet"/>
-            </w:pPr>
-            <w:r>
-              <w:t>What are ‘hidden layers’?</w:t>
-            </w:r>
-            <w:r/>
-            <w:r/>
-          </w:p>
-          <w:p>
-            <w:pPr>
-              <w:pStyle w:val="ListBullet"/>
-            </w:pPr>
-            <w:r>
-              <w:t>How can we teach machines to think good?</w:t>
-            </w:r>
-            <w:r/>
-            <w:r/>
-          </w:p>
-          <w:p>
-            <w:pPr>
-              <w:pStyle w:val="ListBullet2"/>
-            </w:pPr>
-            <w:r>
-              <w:t>Training, Test, and Validation Loops for Deep Learning</w:t>
-            </w:r>
-            <w:r/>
-            <w:r/>
-          </w:p>
-          <w:p>
-            <w:pPr>
-              <w:pStyle w:val="ListBullet2"/>
-            </w:pPr>
-            <w:r>
-              <w:t>Stochastic Gradient Descent</w:t>
-            </w:r>
-            <w:r/>
-            <w:r/>
-          </w:p>
-          <w:p>
-            <w:pPr>
-              <w:pStyle w:val="ListBullet2"/>
-            </w:pPr>
-            <w:r>
-              <w:t>Backpropagation of the Loss</w:t>
-            </w:r>
-            <w:r/>
-            <w:r/>
-          </w:p>
-          <w:p>
-            <w:pPr>
-              <w:pStyle w:val="ListBullet"/>
-            </w:pPr>
-            <w:r>
-              <w:t>Machine Vision</w:t>
-            </w:r>
-            <w:r/>
-            <w:r/>
-          </w:p>
-          <w:p>
-            <w:pPr>
-              <w:pStyle w:val="ListBullet"/>
-            </w:pPr>
-            <w:r>
-              <w:t>Neural network architecture</w:t>
-            </w:r>
-            <w:r/>
-            <w:r/>
-          </w:p>
-          <w:p>
-            <w:pPr>
-              <w:pStyle w:val="ListBullet2"/>
-            </w:pPr>
-            <w:r>
-              <w:t>Multilayer Perceptron (MLP) / Feed-Forward Networks / Fully-connected Networks</w:t>
-            </w:r>
-            <w:r/>
-            <w:r/>
-          </w:p>
-          <w:p>
-            <w:pPr>
-              <w:pStyle w:val="ListBullet2"/>
-            </w:pPr>
-            <w:r>
-              <w:t>Convolutional Neural Networks (CNN) — What does it do, why might it be better for images?</w:t>
-            </w:r>
-            <w:r/>
-            <w:r/>
-          </w:p>
-          <w:p>
-            <w:pPr>
-              <w:pStyle w:val="ListBullet2"/>
-            </w:pPr>
-            <w:r>
-              <w:t>Recurrent Neural Networks — (Stateful networks) Why should we keep track of state?</w:t>
-            </w:r>
-            <w:r/>
-          </w:p>
-          <w:p>
-            <w:r/>
-          </w:p>
-          <w:p>
-            <w:r/>
-            <w:r/>
-            <w:r/>
-          </w:p>
-          <w:p>
-            <w:r>
-              <w:rPr>
-                <w:b w:val="0"/>
-                <w:i/>
-              </w:rPr>
-              <w:t>Lab: Training a FFN on MNIST in Pytorch</w:t>
-            </w:r>
-            <w:r/>
-          </w:p>
-          <w:p>
-            <w:r/>
-            <w:r/>
-            <w:r/>
-          </w:p>
-          <w:p>
             <w:r>
               <w:rPr>
                 <w:b/>
-                <w:i w:val="0"/>
               </w:rPr>
               <w:t>Let's look at the KBA (Assessment 2 KBA)</w:t>
             </w:r>
@@ -5837,70 +5443,42 @@
             </w:r>
           </w:p>
           <w:p>
-            <w:r/>
-            <w:r/>
-            <w:r/>
-            <w:hyperlink r:id="rId41">
+            <w:hyperlink r:id="rId41" w:history="1">
               <w:r>
                 <w:rPr>
-                  <w:color w:val="0000EE"/>
+                  <w:color w:val="0000FF"/>
                   <w:u w:val="single"/>
                 </w:rPr>
                 <w:t>But what is a neural network?</w:t>
               </w:r>
             </w:hyperlink>
-            <w:r>
-              <w:br/>
-            </w:r>
-            <w:r/>
-            <w:r/>
-            <w:r/>
-            <w:hyperlink r:id="rId37">
+            <w:hyperlink r:id="rId37" w:history="1">
               <w:r>
                 <w:rPr>
-                  <w:color w:val="0000EE"/>
+                  <w:color w:val="0000FF"/>
                   <w:u w:val="single"/>
                 </w:rPr>
                 <w:t>Gradient descent, how neural networks learn</w:t>
               </w:r>
             </w:hyperlink>
-            <w:r>
-              <w:br/>
-            </w:r>
-            <w:r/>
-            <w:r/>
-            <w:r/>
-            <w:hyperlink r:id="rId42">
+            <w:hyperlink r:id="rId42" w:history="1">
               <w:r>
                 <w:rPr>
-                  <w:color w:val="0000EE"/>
+                  <w:color w:val="0000FF"/>
                   <w:u w:val="single"/>
                 </w:rPr>
                 <w:t>What is backpropagation really doing?</w:t>
               </w:r>
             </w:hyperlink>
-            <w:r>
-              <w:br/>
-            </w:r>
-            <w:r/>
-            <w:r/>
-            <w:r/>
-            <w:hyperlink r:id="rId43">
+            <w:hyperlink r:id="rId43" w:history="1">
               <w:r>
                 <w:rPr>
-                  <w:color w:val="0000EE"/>
+                  <w:color w:val="0000FF"/>
                   <w:u w:val="single"/>
                 </w:rPr>
                 <w:t>What is a convolution?</w:t>
               </w:r>
             </w:hyperlink>
-            <w:r>
-              <w:br/>
-            </w:r>
-            <w:r/>
-          </w:p>
-          <w:p>
-            <w:r/>
           </w:p>
           <w:p>
             <w:r>
@@ -5908,25 +5486,15 @@
             </w:r>
           </w:p>
           <w:p>
-            <w:r/>
-            <w:r/>
-            <w:r/>
-            <w:hyperlink r:id="rId44">
+            <w:hyperlink r:id="rId44" w:history="1">
               <w:r>
                 <w:rPr>
-                  <w:color w:val="0000EE"/>
+                  <w:color w:val="0000FF"/>
                   <w:u w:val="single"/>
                 </w:rPr>
                 <w:t>A Nice Article by Stephen Wolfram (highly technical but solid explanation &amp; visuals)</w:t>
               </w:r>
             </w:hyperlink>
-            <w:r>
-              <w:br/>
-            </w:r>
-            <w:r/>
-          </w:p>
-          <w:p>
-            <w:r/>
           </w:p>
           <w:p>
             <w:r>
@@ -5934,94 +5502,59 @@
             </w:r>
           </w:p>
           <w:p>
-            <w:r/>
-          </w:p>
-          <w:p>
             <w:r>
               <w:t>Line By Line Intro to a pytorch neural network (with a cool song!):</w:t>
             </w:r>
-            <w:r/>
-            <w:r/>
-            <w:hyperlink r:id="rId45">
+            <w:hyperlink r:id="rId45" w:history="1">
               <w:r>
                 <w:rPr>
-                  <w:color w:val="0000EE"/>
+                  <w:color w:val="0000FF"/>
                   <w:u w:val="single"/>
                 </w:rPr>
                 <w:t>StatsQuest Introduction to pytorch</w:t>
               </w:r>
             </w:hyperlink>
-            <w:r>
-              <w:br/>
-            </w:r>
-            <w:r/>
-            <w:r/>
-            <w:r/>
-            <w:hyperlink r:id="rId46">
+            <w:hyperlink r:id="rId46" w:history="1">
               <w:r>
                 <w:rPr>
-                  <w:color w:val="0000EE"/>
+                  <w:color w:val="0000FF"/>
                   <w:u w:val="single"/>
                 </w:rPr>
                 <w:t>Code on Lightning AI</w:t>
               </w:r>
             </w:hyperlink>
-            <w:r>
-              <w:br/>
-            </w:r>
-            <w:r/>
-          </w:p>
-          <w:p>
-            <w:r/>
           </w:p>
           <w:p>
             <w:r>
               <w:t>Lab:</w:t>
             </w:r>
-            <w:r/>
-            <w:r/>
-          </w:p>
-          <w:p>
-            <w:r>
-              <w:rPr>
-                <w:b w:val="0"/>
+            <w:r>
+              <w:rPr>
                 <w:i/>
               </w:rPr>
               <w:t>Let's solve MNIST with pytorch</w:t>
             </w:r>
             <w:r>
-              <w:t xml:space="preserve">: </w:t>
-            </w:r>
-            <w:r/>
-            <w:r/>
-            <w:hyperlink r:id="rId47">
+              <w:t>:</w:t>
+            </w:r>
+            <w:hyperlink r:id="rId47" w:history="1">
               <w:r>
                 <w:rPr>
-                  <w:color w:val="0000EE"/>
+                  <w:color w:val="0000FF"/>
                   <w:u w:val="single"/>
                 </w:rPr>
                 <w:t>Kaggle Competition</w:t>
               </w:r>
             </w:hyperlink>
-            <w:r>
-              <w:br/>
-            </w:r>
-            <w:r/>
-            <w:r/>
-            <w:r/>
-            <w:hyperlink r:id="rId48">
+            <w:hyperlink r:id="rId48" w:history="1">
               <w:r>
                 <w:rPr>
-                  <w:color w:val="0000EE"/>
+                  <w:color w:val="0000FF"/>
                   <w:u w:val="single"/>
                 </w:rPr>
                 <w:t>Worked example on Kaggle</w:t>
               </w:r>
             </w:hyperlink>
-            <w:r>
-              <w:br/>
-            </w:r>
-            <w:r/>
           </w:p>
         </w:tc>
         <w:tc>
@@ -6042,33 +5575,26 @@
                 <w:szCs w:val="20"/>
               </w:rPr>
             </w:pPr>
+          </w:p>
+          <w:p>
             <w:r/>
-            <w:r/>
-          </w:p>
-          <w:p>
             <w:r>
               <w:rPr>
                 <w:b/>
-                <w:i w:val="0"/>
               </w:rPr>
               <w:t>"Computer Friendly" by Eileen Gunn</w:t>
             </w:r>
             <w:r>
               <w:t xml:space="preserve"> (1989)</w:t>
             </w:r>
-            <w:r/>
-          </w:p>
-          <w:p>
-            <w:pPr>
-              <w:pStyle w:val="ListBullet2"/>
+          </w:p>
+          <w:p>
+            <w:pPr>
+              <w:pStyle w:val="ListBullet"/>
             </w:pPr>
             <w:r>
               <w:t>This short story is a speculative look at AI in education, exploring the impact of computer-managed teaching on students and society.</w:t>
             </w:r>
-            <w:r/>
-          </w:p>
-          <w:p>
-            <w:r/>
           </w:p>
           <w:p>
             <w:r>
@@ -6076,25 +5602,15 @@
             </w:r>
           </w:p>
           <w:p>
-            <w:r/>
-            <w:r/>
-            <w:r/>
-            <w:hyperlink r:id="rId49">
+            <w:hyperlink r:id="rId49" w:history="1">
               <w:r>
                 <w:rPr>
-                  <w:color w:val="0000EE"/>
+                  <w:color w:val="0000FF"/>
                   <w:u w:val="single"/>
                 </w:rPr>
                 <w:t>Neural Networks</w:t>
               </w:r>
             </w:hyperlink>
-            <w:r>
-              <w:br/>
-            </w:r>
-            <w:r/>
-          </w:p>
-          <w:p>
-            <w:r/>
           </w:p>
           <w:p>
             <w:r>
@@ -6243,7 +5759,6 @@
             <w:r>
               <w:t>Week 10: Fundamentals in Deep Learning &amp; Introduction to Machine Vision</w:t>
             </w:r>
-            <w:r/>
           </w:p>
           <w:p>
             <w:pPr>
@@ -6252,8 +5767,6 @@
             <w:r>
               <w:t>Linear algebra for ML — scalars, vectors, and tensors</w:t>
             </w:r>
-            <w:r/>
-            <w:r/>
           </w:p>
           <w:p>
             <w:pPr>
@@ -6262,8 +5775,6 @@
             <w:r>
               <w:t>Computing Tensors, GPU vs CPU</w:t>
             </w:r>
-            <w:r/>
-            <w:r/>
           </w:p>
           <w:p>
             <w:pPr>
@@ -6272,8 +5783,6 @@
             <w:r>
               <w:t>Feature Engineering and Data Preprocessing Techniques for Deep Learning</w:t>
             </w:r>
-            <w:r/>
-            <w:r/>
           </w:p>
           <w:p>
             <w:pPr>
@@ -6282,57 +5791,38 @@
             <w:r>
               <w:t>Activation functions:</w:t>
             </w:r>
-            <w:r/>
-            <w:r/>
-          </w:p>
-          <w:p>
-            <w:pPr>
-              <w:pStyle w:val="ListBullet2"/>
+          </w:p>
+          <w:p>
+            <w:pPr>
+              <w:pStyle w:val="ListBullet"/>
             </w:pPr>
             <w:r>
               <w:t>ReLU (Hidden Layer activations)</w:t>
             </w:r>
-            <w:r/>
-            <w:r/>
-          </w:p>
-          <w:p>
-            <w:pPr>
-              <w:pStyle w:val="ListBullet2"/>
+          </w:p>
+          <w:p>
+            <w:pPr>
+              <w:pStyle w:val="ListBullet"/>
             </w:pPr>
             <w:r>
               <w:t>SoftMax (Output Layer activations)</w:t>
             </w:r>
-            <w:r/>
-          </w:p>
-          <w:p>
-            <w:r/>
-            <w:r/>
-            <w:r/>
-          </w:p>
-          <w:p>
-            <w:r>
-              <w:rPr>
-                <w:b w:val="0"/>
+          </w:p>
+          <w:p>
+            <w:r>
+              <w:rPr>
                 <w:i/>
               </w:rPr>
               <w:t>Let's look at CNN and Machine vision more closely</w:t>
             </w:r>
-            <w:r/>
-          </w:p>
-          <w:p>
-            <w:r/>
-            <w:r/>
-            <w:r/>
-          </w:p>
-          <w:p>
-            <w:r>
-              <w:rPr>
-                <w:b w:val="0"/>
+          </w:p>
+          <w:p>
+            <w:r>
+              <w:rPr>
                 <w:i/>
               </w:rPr>
               <w:t>Term Break</w:t>
             </w:r>
-            <w:r/>
           </w:p>
         </w:tc>
         <w:tc>
@@ -6352,24 +5842,17 @@
                 <w:szCs w:val="20"/>
               </w:rPr>
             </w:pPr>
-            <w:r/>
-            <w:r/>
-            <w:hyperlink r:id="rId50">
+          </w:p>
+          <w:p>
+            <w:hyperlink r:id="rId50" w:history="1">
               <w:r>
                 <w:rPr>
-                  <w:color w:val="0000EE"/>
+                  <w:color w:val="0000FF"/>
                   <w:u w:val="single"/>
                 </w:rPr>
                 <w:t>Vectors</w:t>
               </w:r>
             </w:hyperlink>
-            <w:r>
-              <w:br/>
-            </w:r>
-            <w:r/>
-          </w:p>
-          <w:p>
-            <w:r/>
           </w:p>
           <w:p>
             <w:r>
@@ -6377,25 +5860,15 @@
             </w:r>
           </w:p>
           <w:p>
-            <w:r/>
-            <w:r/>
-            <w:r/>
-            <w:hyperlink r:id="rId51">
+            <w:hyperlink r:id="rId51" w:history="1">
               <w:r>
                 <w:rPr>
-                  <w:color w:val="0000EE"/>
+                  <w:color w:val="0000FF"/>
                   <w:u w:val="single"/>
                 </w:rPr>
                 <w:t>Vectors and Tensors</w:t>
               </w:r>
             </w:hyperlink>
-            <w:r>
-              <w:br/>
-            </w:r>
-            <w:r/>
-          </w:p>
-          <w:p>
-            <w:r/>
           </w:p>
           <w:p>
             <w:r>
@@ -6403,89 +5876,53 @@
             </w:r>
           </w:p>
           <w:p>
-            <w:r/>
-            <w:r/>
-            <w:r/>
-            <w:hyperlink r:id="rId52">
+            <w:hyperlink r:id="rId52" w:history="1">
               <w:r>
                 <w:rPr>
-                  <w:color w:val="0000EE"/>
+                  <w:color w:val="0000FF"/>
                   <w:u w:val="single"/>
                 </w:rPr>
                 <w:t>GPU vs CPU Mythbusters</w:t>
               </w:r>
             </w:hyperlink>
-            <w:r>
-              <w:br/>
-            </w:r>
-            <w:r/>
-            <w:r/>
-            <w:r/>
-            <w:hyperlink r:id="rId53">
+            <w:hyperlink r:id="rId53" w:history="1">
               <w:r>
                 <w:rPr>
-                  <w:color w:val="0000EE"/>
+                  <w:color w:val="0000FF"/>
                   <w:u w:val="single"/>
                 </w:rPr>
                 <w:t>Extension: CUDA &amp; NVLink</w:t>
               </w:r>
             </w:hyperlink>
-            <w:r>
-              <w:br/>
-            </w:r>
-            <w:r/>
-            <w:r/>
-            <w:r/>
-            <w:hyperlink r:id="rId54">
+            <w:hyperlink r:id="rId54" w:history="1">
               <w:r>
                 <w:rPr>
-                  <w:color w:val="0000EE"/>
+                  <w:color w:val="0000FF"/>
                   <w:u w:val="single"/>
                 </w:rPr>
                 <w:t>GPU for AI/ML/DL</w:t>
               </w:r>
             </w:hyperlink>
             <w:r>
-              <w:br/>
-            </w:r>
-            <w:r/>
-          </w:p>
-          <w:p>
-            <w:r>
               <w:t>Activity:</w:t>
             </w:r>
           </w:p>
           <w:p>
-            <w:r/>
-            <w:r/>
-            <w:r/>
-          </w:p>
-          <w:p>
-            <w:r>
-              <w:rPr>
-                <w:b w:val="0"/>
+            <w:r>
+              <w:rPr>
                 <w:i/>
               </w:rPr>
               <w:t>Lab:</w:t>
             </w:r>
-            <w:r>
-              <w:t xml:space="preserve"> </w:t>
-            </w:r>
-            <w:r/>
-            <w:r/>
-            <w:hyperlink r:id="rId55">
+            <w:hyperlink r:id="rId55" w:history="1">
               <w:r>
                 <w:rPr>
-                  <w:color w:val="0000EE"/>
+                  <w:color w:val="0000FF"/>
                   <w:u w:val="single"/>
                 </w:rPr>
                 <w:t>Kaggle Notebook</w:t>
               </w:r>
             </w:hyperlink>
-            <w:r>
-              <w:br/>
-            </w:r>
-            <w:r/>
           </w:p>
         </w:tc>
         <w:tc>
@@ -6506,14 +5943,12 @@
                 <w:szCs w:val="20"/>
               </w:rPr>
             </w:pPr>
+          </w:p>
+          <w:p>
             <w:r/>
-            <w:r/>
-          </w:p>
-          <w:p>
             <w:r>
               <w:rPr>
                 <w:b/>
-                <w:i w:val="0"/>
               </w:rPr>
               <w:t>"The Girl-Thing Who Went Out for Sushi" by Pat Cadigan</w:t>
             </w:r>
@@ -6522,20 +5957,12 @@
             </w:r>
           </w:p>
           <w:p>
-            <w:r/>
-            <w:r/>
-          </w:p>
-          <w:p>
-            <w:pPr>
-              <w:pStyle w:val="ListBullet2"/>
+            <w:pPr>
+              <w:pStyle w:val="ListBullet"/>
             </w:pPr>
             <w:r>
               <w:t>Set in an environment of body modification and post-humanity, this story looks at AI and transhumanism through the fascinating lens of transformed humans working in space.</w:t>
             </w:r>
-            <w:r/>
-          </w:p>
-          <w:p>
-            <w:r/>
           </w:p>
           <w:p>
             <w:r>
@@ -6543,56 +5970,34 @@
             </w:r>
           </w:p>
           <w:p>
-            <w:r/>
-          </w:p>
-          <w:p>
             <w:r>
               <w:t>We are at the point in the course where you have a decision to make.</w:t>
             </w:r>
-          </w:p>
-          <w:p>
             <w:r>
               <w:t>Do I want to understand the math or do I want to focus on applying AI.</w:t>
             </w:r>
           </w:p>
           <w:p>
-            <w:r/>
-            <w:r/>
-            <w:r/>
-            <w:hyperlink r:id="rId56">
+            <w:hyperlink r:id="rId56" w:history="1">
               <w:r>
                 <w:rPr>
-                  <w:color w:val="0000EE"/>
+                  <w:color w:val="0000FF"/>
                   <w:u w:val="single"/>
                 </w:rPr>
                 <w:t>Linear Algebra</w:t>
               </w:r>
             </w:hyperlink>
-            <w:r>
-              <w:br/>
-            </w:r>
-            <w:r/>
-          </w:p>
-          <w:p>
-            <w:r/>
-            <w:r/>
-            <w:r/>
-            <w:hyperlink r:id="rId57">
+          </w:p>
+          <w:p>
+            <w:hyperlink r:id="rId57" w:history="1">
               <w:r>
                 <w:rPr>
-                  <w:color w:val="0000EE"/>
+                  <w:color w:val="0000FF"/>
                   <w:u w:val="single"/>
                 </w:rPr>
                 <w:t>Calculus</w:t>
               </w:r>
             </w:hyperlink>
-            <w:r>
-              <w:br/>
-            </w:r>
-            <w:r/>
-          </w:p>
-          <w:p>
-            <w:r/>
           </w:p>
           <w:p>
             <w:r>
@@ -6600,77 +6005,48 @@
             </w:r>
           </w:p>
           <w:p>
-            <w:r/>
-          </w:p>
-          <w:p>
             <w:r>
               <w:t>If you're strapped for time the most important topics to review are:</w:t>
             </w:r>
           </w:p>
           <w:p>
-            <w:r/>
-            <w:r/>
-            <w:r/>
-            <w:hyperlink r:id="rId58">
+            <w:hyperlink r:id="rId58" w:history="1">
               <w:r>
                 <w:rPr>
-                  <w:color w:val="0000EE"/>
+                  <w:color w:val="0000FF"/>
                   <w:u w:val="single"/>
                 </w:rPr>
                 <w:t>Vectors</w:t>
               </w:r>
             </w:hyperlink>
-            <w:r>
-              <w:br/>
-            </w:r>
-            <w:r/>
-          </w:p>
-          <w:p>
-            <w:r/>
-            <w:r/>
-            <w:r/>
-            <w:hyperlink r:id="rId59">
+          </w:p>
+          <w:p>
+            <w:hyperlink r:id="rId59" w:history="1">
               <w:r>
                 <w:rPr>
-                  <w:color w:val="0000EE"/>
+                  <w:color w:val="0000FF"/>
                   <w:u w:val="single"/>
                 </w:rPr>
                 <w:t>Chain rule &amp; Dot Products</w:t>
               </w:r>
             </w:hyperlink>
-            <w:r>
-              <w:br/>
-            </w:r>
-            <w:r/>
-          </w:p>
-          <w:p>
-            <w:r/>
-            <w:r/>
-            <w:r/>
-            <w:hyperlink r:id="rId60">
+          </w:p>
+          <w:p>
+            <w:hyperlink r:id="rId60" w:history="1">
               <w:r>
                 <w:rPr>
-                  <w:color w:val="0000EE"/>
+                  <w:color w:val="0000FF"/>
                   <w:u w:val="single"/>
                 </w:rPr>
                 <w:t>Abstract Vector Spaces</w:t>
               </w:r>
             </w:hyperlink>
-            <w:r>
-              <w:br/>
-            </w:r>
+          </w:p>
+          <w:p>
             <w:r/>
-          </w:p>
-          <w:p>
-            <w:r/>
-            <w:r/>
-            <w:r/>
-          </w:p>
-          <w:p>
             <w:r>
               <w:rPr>
                 <w:b/>
-                <w:i w:val="0"/>
               </w:rPr>
               <w:t>AT2 KBA — Work on it over the break!</w:t>
             </w:r>
@@ -6818,7 +6194,6 @@
             <w:r>
               <w:t>Week 11: Applying AI/ML and Data Science Methodologies</w:t>
             </w:r>
-            <w:r/>
           </w:p>
           <w:p>
             <w:pPr>
@@ -6827,62 +6202,46 @@
             <w:r>
               <w:t>Understanding CRISP-DM methodology and software development for ML.</w:t>
             </w:r>
-            <w:r/>
-            <w:r/>
-          </w:p>
-          <w:p>
-            <w:pPr>
-              <w:pStyle w:val="ListBullet2"/>
+          </w:p>
+          <w:p>
+            <w:pPr>
+              <w:pStyle w:val="ListBullet"/>
             </w:pPr>
             <w:r>
               <w:t>Cross-Industry Standard Process for Data Mining (CRISP-DM)</w:t>
             </w:r>
-            <w:r/>
-            <w:r/>
-          </w:p>
-          <w:p>
-            <w:pPr>
-              <w:pStyle w:val="ListBullet2"/>
+          </w:p>
+          <w:p>
+            <w:pPr>
+              <w:pStyle w:val="ListBullet"/>
             </w:pPr>
             <w:r>
               <w:t>Applying Organizational Policies and Procedures to AI</w:t>
             </w:r>
-            <w:r/>
-            <w:r/>
-          </w:p>
-          <w:p>
-            <w:pPr>
-              <w:pStyle w:val="ListBullet2"/>
+          </w:p>
+          <w:p>
+            <w:pPr>
+              <w:pStyle w:val="ListBullet"/>
             </w:pPr>
             <w:r>
               <w:t>Software development methodologies relevant to AI/ML</w:t>
             </w:r>
-            <w:r/>
-            <w:r/>
-          </w:p>
-          <w:p>
-            <w:pPr>
-              <w:pStyle w:val="ListBullet2"/>
+          </w:p>
+          <w:p>
+            <w:pPr>
+              <w:pStyle w:val="ListBullet"/>
             </w:pPr>
             <w:r>
               <w:t>Applying organizational policies and procedures, and legislation to work tasks</w:t>
             </w:r>
-            <w:r/>
-          </w:p>
-          <w:p>
-            <w:r/>
-            <w:r/>
-            <w:r/>
-          </w:p>
-          <w:p>
-            <w:r>
-              <w:rPr>
-                <w:b w:val="0"/>
+          </w:p>
+          <w:p>
+            <w:r>
+              <w:rPr>
                 <w:i/>
               </w:rPr>
               <w:t>Let’s build: A card classifier using pytorch.</w:t>
             </w:r>
-            <w:r/>
           </w:p>
         </w:tc>
         <w:tc>
@@ -6902,24 +6261,17 @@
                 <w:szCs w:val="20"/>
               </w:rPr>
             </w:pPr>
-            <w:r/>
-            <w:r/>
-            <w:hyperlink r:id="rId61">
+          </w:p>
+          <w:p>
+            <w:hyperlink r:id="rId61" w:history="1">
               <w:r>
                 <w:rPr>
-                  <w:color w:val="0000EE"/>
+                  <w:color w:val="0000FF"/>
                   <w:u w:val="single"/>
                 </w:rPr>
                 <w:t>CRISP-DM in 5 mins</w:t>
               </w:r>
             </w:hyperlink>
-            <w:r>
-              <w:br/>
-            </w:r>
-            <w:r/>
-          </w:p>
-          <w:p>
-            <w:r/>
           </w:p>
           <w:p>
             <w:r>
@@ -6927,113 +6279,70 @@
             </w:r>
           </w:p>
           <w:p>
-            <w:r/>
-            <w:r/>
-            <w:r/>
-            <w:hyperlink r:id="rId62">
+            <w:hyperlink r:id="rId62" w:history="1">
               <w:r>
                 <w:rPr>
-                  <w:color w:val="0000EE"/>
+                  <w:color w:val="0000FF"/>
                   <w:u w:val="single"/>
                 </w:rPr>
                 <w:t>Crisp-DM (Data Science Process Alliance)</w:t>
               </w:r>
             </w:hyperlink>
-            <w:r>
-              <w:br/>
-            </w:r>
-            <w:r/>
-            <w:r/>
-            <w:r/>
-            <w:hyperlink r:id="rId63">
+            <w:hyperlink r:id="rId63" w:history="1">
               <w:r>
                 <w:rPr>
-                  <w:color w:val="0000EE"/>
+                  <w:color w:val="0000FF"/>
                   <w:u w:val="single"/>
                 </w:rPr>
                 <w:t>Crisp-DM IBM</w:t>
               </w:r>
             </w:hyperlink>
-            <w:r>
-              <w:br/>
-            </w:r>
-            <w:r/>
-            <w:r/>
-            <w:r/>
-            <w:hyperlink r:id="rId64">
+            <w:hyperlink r:id="rId64" w:history="1">
               <w:r>
                 <w:rPr>
-                  <w:color w:val="0000EE"/>
+                  <w:color w:val="0000FF"/>
                   <w:u w:val="single"/>
                 </w:rPr>
                 <w:t>Crisp-DM O'Reilly</w:t>
               </w:r>
             </w:hyperlink>
             <w:r>
-              <w:br/>
-            </w:r>
-            <w:r/>
-          </w:p>
-          <w:p>
-            <w:r>
               <w:t>CRISP-DM Expanded for ML:</w:t>
             </w:r>
           </w:p>
           <w:p>
-            <w:r/>
-            <w:r/>
-            <w:r/>
-            <w:hyperlink r:id="rId65">
+            <w:hyperlink r:id="rId65" w:history="1">
               <w:r>
                 <w:rPr>
-                  <w:color w:val="0000EE"/>
+                  <w:color w:val="0000FF"/>
                   <w:u w:val="single"/>
                 </w:rPr>
                 <w:t>The ML Process</w:t>
               </w:r>
             </w:hyperlink>
             <w:r>
-              <w:br/>
-            </w:r>
-            <w:r/>
-          </w:p>
-          <w:p>
-            <w:r>
               <w:t>Lab (Machine Vision):</w:t>
             </w:r>
           </w:p>
           <w:p>
-            <w:r/>
-            <w:r/>
-            <w:r/>
-            <w:hyperlink r:id="rId66">
+            <w:hyperlink r:id="rId66" w:history="1">
               <w:r>
                 <w:rPr>
-                  <w:color w:val="0000EE"/>
+                  <w:color w:val="0000FF"/>
                   <w:u w:val="single"/>
                 </w:rPr>
                 <w:t>Build Your First Pytorch Model In Minutes! [Tutorial + Code]</w:t>
               </w:r>
             </w:hyperlink>
-            <w:r>
-              <w:br/>
-            </w:r>
-            <w:r/>
-            <w:r/>
-            <w:r/>
-            <w:hyperlink r:id="rId67">
+            <w:hyperlink r:id="rId67" w:history="1">
               <w:r>
                 <w:rPr>
-                  <w:color w:val="0000EE"/>
+                  <w:color w:val="0000FF"/>
                   <w:u w:val="single"/>
                 </w:rPr>
                 <w:t>Kaggle Notebook</w:t>
               </w:r>
             </w:hyperlink>
-            <w:r>
-              <w:br/>
-            </w:r>
-            <w:r/>
           </w:p>
         </w:tc>
         <w:tc>
@@ -7054,30 +6363,26 @@
                 <w:szCs w:val="20"/>
               </w:rPr>
             </w:pPr>
+          </w:p>
+          <w:p>
             <w:r/>
-            <w:r/>
-          </w:p>
-          <w:p>
             <w:r>
               <w:rPr>
                 <w:b/>
-                <w:i w:val="0"/>
               </w:rPr>
               <w:t>"Eliot Wrote" by Nancy Kress</w:t>
             </w:r>
             <w:r>
               <w:t xml:space="preserve"> (2008)</w:t>
             </w:r>
-            <w:r/>
-          </w:p>
-          <w:p>
-            <w:pPr>
-              <w:pStyle w:val="ListBullet2"/>
+          </w:p>
+          <w:p>
+            <w:pPr>
+              <w:pStyle w:val="ListBullet"/>
             </w:pPr>
             <w:r>
               <w:t>This story focuses on an AI developed to replicate the literary style of T.S. Eliot, examining the possibilities and limits of AI in creative endeavors.</w:t>
             </w:r>
-            <w:r/>
           </w:p>
         </w:tc>
         <w:tc>
@@ -7221,7 +6526,6 @@
             <w:r>
               <w:t>Week 12: Transformers and Embeddings</w:t>
             </w:r>
-            <w:r/>
           </w:p>
           <w:p>
             <w:pPr>
@@ -7230,8 +6534,6 @@
             <w:r>
               <w:t>Attention is all you need!</w:t>
             </w:r>
-            <w:r/>
-            <w:r/>
           </w:p>
           <w:p>
             <w:pPr>
@@ -7240,22 +6542,14 @@
             <w:r>
               <w:t>Intro to Huggingface</w:t>
             </w:r>
-            <w:r/>
-          </w:p>
-          <w:p>
-            <w:r/>
-            <w:r/>
-            <w:r/>
-          </w:p>
-          <w:p>
-            <w:r>
-              <w:rPr>
-                <w:b w:val="0"/>
+          </w:p>
+          <w:p>
+            <w:r>
+              <w:rPr>
                 <w:i/>
               </w:rPr>
               <w:t>Code Investigation: card classifier what does ReLU do?</w:t>
             </w:r>
-            <w:r/>
           </w:p>
         </w:tc>
         <w:tc>
@@ -7275,45 +6569,26 @@
                 <w:szCs w:val="20"/>
               </w:rPr>
             </w:pPr>
-            <w:r/>
-            <w:r/>
-            <w:hyperlink r:id="rId68">
+          </w:p>
+          <w:p>
+            <w:hyperlink r:id="rId68" w:history="1">
               <w:r>
                 <w:rPr>
-                  <w:color w:val="0000EE"/>
+                  <w:color w:val="0000FF"/>
                   <w:u w:val="single"/>
                 </w:rPr>
                 <w:t>Transformers</w:t>
               </w:r>
             </w:hyperlink>
-            <w:r>
-              <w:br/>
-            </w:r>
-            <w:r/>
-            <w:r/>
-            <w:r/>
-            <w:hyperlink r:id="rId69">
+            <w:hyperlink r:id="rId69" w:history="1">
               <w:r>
                 <w:rPr>
-                  <w:color w:val="0000EE"/>
+                  <w:color w:val="0000FF"/>
                   <w:u w:val="single"/>
                 </w:rPr>
                 <w:t>Attention Visually Explained</w:t>
               </w:r>
             </w:hyperlink>
-            <w:r>
-              <w:br/>
-            </w:r>
-            <w:r/>
-          </w:p>
-          <w:p>
-            <w:r/>
-          </w:p>
-          <w:p>
-            <w:r/>
-          </w:p>
-          <w:p>
-            <w:r/>
           </w:p>
           <w:p>
             <w:r>
@@ -7321,40 +6596,24 @@
             </w:r>
           </w:p>
           <w:p>
-            <w:r/>
-          </w:p>
-          <w:p>
-            <w:r/>
-            <w:r/>
-            <w:r/>
-            <w:hyperlink r:id="rId70">
+            <w:hyperlink r:id="rId70" w:history="1">
               <w:r>
                 <w:rPr>
-                  <w:color w:val="0000EE"/>
+                  <w:color w:val="0000FF"/>
                   <w:u w:val="single"/>
                 </w:rPr>
                 <w:t>Attention is all you need!</w:t>
               </w:r>
             </w:hyperlink>
-            <w:r>
-              <w:br/>
-            </w:r>
-            <w:r/>
-            <w:r/>
-            <w:r/>
-            <w:hyperlink r:id="rId71">
+            <w:hyperlink r:id="rId71" w:history="1">
               <w:r>
                 <w:rPr>
-                  <w:color w:val="0000EE"/>
+                  <w:color w:val="0000FF"/>
                   <w:u w:val="single"/>
                 </w:rPr>
                 <w:t>Efficient Estimation of Word Representations in Vector Space</w:t>
               </w:r>
             </w:hyperlink>
-            <w:r>
-              <w:br/>
-            </w:r>
-            <w:r/>
           </w:p>
         </w:tc>
         <w:tc>
@@ -7375,30 +6634,26 @@
                 <w:szCs w:val="20"/>
               </w:rPr>
             </w:pPr>
+          </w:p>
+          <w:p>
             <w:r/>
-            <w:r/>
-          </w:p>
-          <w:p>
             <w:r>
               <w:rPr>
                 <w:b/>
-                <w:i w:val="0"/>
               </w:rPr>
               <w:t>"For a Breath I Tarry" by Roger Zelazny</w:t>
             </w:r>
             <w:r>
               <w:t xml:space="preserve"> (1966)</w:t>
             </w:r>
-            <w:r/>
-          </w:p>
-          <w:p>
-            <w:pPr>
-              <w:pStyle w:val="ListBullet2"/>
+          </w:p>
+          <w:p>
+            <w:pPr>
+              <w:pStyle w:val="ListBullet"/>
             </w:pPr>
             <w:r>
               <w:t>Set in a post-human world, it follows an AI’s quest to become human and explores deeply philosophical themes of identity and existence.</w:t>
             </w:r>
-            <w:r/>
           </w:p>
         </w:tc>
         <w:tc>
@@ -7543,7 +6798,6 @@
             <w:r>
               <w:t>Week 13: Intro to Language Models — Small Text Models</w:t>
             </w:r>
-            <w:r/>
           </w:p>
           <w:p>
             <w:pPr>
@@ -7552,27 +6806,22 @@
             <w:r>
               <w:t>Who is LoRA?</w:t>
             </w:r>
-            <w:r/>
-            <w:r/>
-          </w:p>
-          <w:p>
-            <w:pPr>
-              <w:pStyle w:val="ListBullet2"/>
+          </w:p>
+          <w:p>
+            <w:pPr>
+              <w:pStyle w:val="ListBullet"/>
             </w:pPr>
             <w:r>
               <w:t>Fine-tuning Large Language Models</w:t>
             </w:r>
-            <w:r/>
-            <w:r/>
-          </w:p>
-          <w:p>
-            <w:pPr>
-              <w:pStyle w:val="ListBullet2"/>
+          </w:p>
+          <w:p>
+            <w:pPr>
+              <w:pStyle w:val="ListBullet"/>
             </w:pPr>
             <w:r>
               <w:t>Model sizes &amp; related challenges</w:t>
             </w:r>
-            <w:r/>
           </w:p>
         </w:tc>
         <w:tc>
@@ -7592,24 +6841,17 @@
                 <w:szCs w:val="20"/>
               </w:rPr>
             </w:pPr>
-            <w:r/>
-            <w:r/>
-            <w:hyperlink r:id="rId72">
+          </w:p>
+          <w:p>
+            <w:hyperlink r:id="rId72" w:history="1">
               <w:r>
                 <w:rPr>
-                  <w:color w:val="0000EE"/>
+                  <w:color w:val="0000FF"/>
                   <w:u w:val="single"/>
                 </w:rPr>
                 <w:t>Explanation of 'decoder only' Transformers</w:t>
               </w:r>
             </w:hyperlink>
-            <w:r>
-              <w:br/>
-            </w:r>
-            <w:r/>
-          </w:p>
-          <w:p>
-            <w:r/>
           </w:p>
           <w:p>
             <w:r>
@@ -7617,22 +6859,15 @@
             </w:r>
           </w:p>
           <w:p>
-            <w:r/>
-            <w:r/>
-            <w:r/>
-            <w:hyperlink r:id="rId73">
+            <w:hyperlink r:id="rId73" w:history="1">
               <w:r>
                 <w:rPr>
-                  <w:color w:val="0000EE"/>
+                  <w:color w:val="0000FF"/>
                   <w:u w:val="single"/>
                 </w:rPr>
                 <w:t>LoRA: Low-Rank Adaptation of Large Language Models</w:t>
               </w:r>
             </w:hyperlink>
-            <w:r>
-              <w:br/>
-            </w:r>
-            <w:r/>
           </w:p>
         </w:tc>
         <w:tc>
@@ -7653,33 +6888,21 @@
                 <w:szCs w:val="20"/>
               </w:rPr>
             </w:pPr>
+          </w:p>
+          <w:p>
             <w:r/>
-            <w:r/>
-          </w:p>
-          <w:p>
             <w:r>
               <w:rPr>
                 <w:b/>
-                <w:i w:val="0"/>
               </w:rPr>
               <w:t>"Coming of Age in Karhide" by Ursula K. Le Guin</w:t>
             </w:r>
             <w:r>
               <w:t xml:space="preserve"> (1995)</w:t>
             </w:r>
-            <w:r/>
-          </w:p>
-          <w:p>
-            <w:pPr>
-              <w:pStyle w:val="ListBullet3"/>
-            </w:pPr>
-            <w:r>
-              <w:t>Although it includes broader themes, the perspective on societal evolution with AI-environment integration is relevant and enriches discussions about AI in different cultural contexts.</w:t>
-            </w:r>
-            <w:r/>
-          </w:p>
-          <w:p>
-            <w:r/>
+            <w:r>
+              <w:t>- Although it includes broader themes, the perspective on societal evolution with AI-environment integration is relevant and enriches discussions about AI in different cultural contexts.</w:t>
+            </w:r>
           </w:p>
           <w:p>
             <w:r>
@@ -7687,52 +6910,33 @@
             </w:r>
           </w:p>
           <w:p>
-            <w:r/>
-            <w:r/>
-            <w:r/>
-            <w:hyperlink r:id="rId74">
+            <w:hyperlink r:id="rId74" w:history="1">
               <w:r>
                 <w:rPr>
-                  <w:color w:val="0000EE"/>
+                  <w:color w:val="0000FF"/>
                   <w:u w:val="single"/>
                 </w:rPr>
                 <w:t>Arthur C. Clarke, 2001: A Space Odyssey</w:t>
               </w:r>
             </w:hyperlink>
-            <w:r>
-              <w:br/>
-            </w:r>
-            <w:r/>
-            <w:r/>
-            <w:r/>
-            <w:hyperlink r:id="rId75">
+            <w:hyperlink r:id="rId75" w:history="1">
               <w:r>
                 <w:rPr>
-                  <w:color w:val="0000EE"/>
+                  <w:color w:val="0000FF"/>
                   <w:u w:val="single"/>
                 </w:rPr>
                 <w:t>Philip K. Dick, Do Androids Dream of Electric Sheep?</w:t>
               </w:r>
             </w:hyperlink>
-            <w:r>
-              <w:br/>
-            </w:r>
-            <w:r/>
-            <w:r/>
-            <w:r/>
-            <w:hyperlink r:id="rId76">
+            <w:hyperlink r:id="rId76" w:history="1">
               <w:r>
                 <w:rPr>
-                  <w:color w:val="0000EE"/>
+                  <w:color w:val="0000FF"/>
                   <w:u w:val="single"/>
                 </w:rPr>
                 <w:t>Neuromancer</w:t>
               </w:r>
             </w:hyperlink>
-            <w:r>
-              <w:br/>
-            </w:r>
-            <w:r/>
           </w:p>
         </w:tc>
         <w:tc>
@@ -7876,7 +7080,6 @@
             <w:r>
               <w:t>Week 14: On the horizon: ViT — Applying Transformers to vision</w:t>
             </w:r>
-            <w:r/>
           </w:p>
           <w:p>
             <w:pPr>
@@ -7885,7 +7088,6 @@
             <w:r>
               <w:t>Applying transformer architecture to multi-modal problems</w:t>
             </w:r>
-            <w:r/>
           </w:p>
         </w:tc>
         <w:tc>
@@ -7905,9 +7107,6 @@
                 <w:szCs w:val="20"/>
               </w:rPr>
             </w:pPr>
-          </w:p>
-          <w:p>
-            <w:r/>
           </w:p>
         </w:tc>
         <w:tc>
@@ -7935,55 +7134,35 @@
             </w:r>
           </w:p>
           <w:p>
-            <w:r/>
-            <w:r/>
-            <w:r/>
-            <w:hyperlink r:id="rId77">
+            <w:hyperlink r:id="rId77" w:history="1">
               <w:r>
                 <w:rPr>
-                  <w:color w:val="0000EE"/>
+                  <w:color w:val="0000FF"/>
                   <w:u w:val="single"/>
                 </w:rPr>
                 <w:t>"SITUATIONAL AWARENESS: The Decade Ahead by Leopold Aschenbrenner, June 2024"</w:t>
               </w:r>
             </w:hyperlink>
-            <w:r>
-              <w:br/>
-            </w:r>
-            <w:r/>
-          </w:p>
-          <w:p>
-            <w:r/>
-            <w:r/>
-            <w:r/>
-            <w:hyperlink r:id="rId77">
+          </w:p>
+          <w:p>
+            <w:hyperlink r:id="rId77" w:history="1">
               <w:r>
                 <w:rPr>
-                  <w:color w:val="0000EE"/>
+                  <w:color w:val="0000FF"/>
                   <w:u w:val="single"/>
                 </w:rPr>
                 <w:t>Introduction</w:t>
               </w:r>
             </w:hyperlink>
-            <w:r>
-              <w:br/>
-            </w:r>
-            <w:r/>
-            <w:r/>
-            <w:r/>
-            <w:hyperlink r:id="rId78">
+            <w:hyperlink r:id="rId78" w:history="1">
               <w:r>
                 <w:rPr>
-                  <w:color w:val="0000EE"/>
+                  <w:color w:val="0000FF"/>
                   <w:u w:val="single"/>
                 </w:rPr>
                 <w:t>I. From GPT-4 to AGI: Counting the OOMs</w:t>
               </w:r>
             </w:hyperlink>
-            <w:r>
-              <w:br/>
-            </w:r>
-            <w:r/>
           </w:p>
         </w:tc>
         <w:tc>
@@ -8193,7 +7372,6 @@
             <w:r>
               <w:t>Week 15: Practical - Begin Project Assessment</w:t>
             </w:r>
-            <w:r/>
           </w:p>
           <w:p>
             <w:pPr>
@@ -8202,7 +7380,6 @@
             <w:r>
               <w:t>Starting the final project: data sourcing and initial model design.</w:t>
             </w:r>
-            <w:r/>
           </w:p>
         </w:tc>
         <w:tc>
@@ -8222,9 +7399,6 @@
                 <w:szCs w:val="20"/>
               </w:rPr>
             </w:pPr>
-          </w:p>
-          <w:p>
-            <w:r/>
           </w:p>
         </w:tc>
         <w:tc>
@@ -8245,21 +7419,17 @@
                 <w:szCs w:val="20"/>
               </w:rPr>
             </w:pPr>
-            <w:r/>
-            <w:r/>
-            <w:hyperlink r:id="rId79">
+          </w:p>
+          <w:p>
+            <w:hyperlink r:id="rId79" w:history="1">
               <w:r>
                 <w:rPr>
-                  <w:color w:val="0000EE"/>
+                  <w:color w:val="0000FF"/>
                   <w:u w:val="single"/>
                 </w:rPr>
                 <w:t>II. From AGI to Superintelligence: the Intelligence Explosion</w:t>
               </w:r>
             </w:hyperlink>
-            <w:r>
-              <w:br/>
-            </w:r>
-            <w:r/>
           </w:p>
         </w:tc>
         <w:tc>
@@ -8469,7 +7639,6 @@
             <w:r>
               <w:t>Week 16: Practical - Continue Project Assessment</w:t>
             </w:r>
-            <w:r/>
           </w:p>
           <w:p>
             <w:pPr>
@@ -8478,7 +7647,6 @@
             <w:r>
               <w:t>Model training and testing.</w:t>
             </w:r>
-            <w:r/>
           </w:p>
         </w:tc>
         <w:tc>
@@ -8498,9 +7666,6 @@
                 <w:szCs w:val="20"/>
               </w:rPr>
             </w:pPr>
-          </w:p>
-          <w:p>
-            <w:r/>
           </w:p>
         </w:tc>
         <w:tc>
@@ -8521,21 +7686,17 @@
                 <w:szCs w:val="20"/>
               </w:rPr>
             </w:pPr>
-            <w:r/>
-            <w:r/>
-            <w:hyperlink r:id="rId80">
+          </w:p>
+          <w:p>
+            <w:hyperlink r:id="rId80" w:history="1">
               <w:r>
                 <w:rPr>
-                  <w:color w:val="0000EE"/>
+                  <w:color w:val="0000FF"/>
                   <w:u w:val="single"/>
                 </w:rPr>
                 <w:t>IIIa. Racing to the Trillion-Dollar Cluster</w:t>
               </w:r>
             </w:hyperlink>
-            <w:r>
-              <w:br/>
-            </w:r>
-            <w:r/>
           </w:p>
         </w:tc>
         <w:tc>
@@ -8745,7 +7906,6 @@
             <w:r>
               <w:t>Week 17: Practical - Continue Project Assessment</w:t>
             </w:r>
-            <w:r/>
           </w:p>
           <w:p>
             <w:pPr>
@@ -8754,7 +7914,6 @@
             <w:r>
               <w:t>Model evaluation and tuning.</w:t>
             </w:r>
-            <w:r/>
           </w:p>
         </w:tc>
         <w:tc>
@@ -8774,9 +7933,6 @@
                 <w:szCs w:val="20"/>
               </w:rPr>
             </w:pPr>
-          </w:p>
-          <w:p>
-            <w:r/>
           </w:p>
         </w:tc>
         <w:tc>
@@ -8797,21 +7953,17 @@
                 <w:szCs w:val="20"/>
               </w:rPr>
             </w:pPr>
-            <w:r/>
-            <w:r/>
-            <w:hyperlink r:id="rId81">
+          </w:p>
+          <w:p>
+            <w:hyperlink r:id="rId81" w:history="1">
               <w:r>
                 <w:rPr>
-                  <w:color w:val="0000EE"/>
+                  <w:color w:val="0000FF"/>
                   <w:u w:val="single"/>
                 </w:rPr>
                 <w:t>IIIb. Lock Down the Labs: Security for AGI</w:t>
               </w:r>
             </w:hyperlink>
-            <w:r>
-              <w:br/>
-            </w:r>
-            <w:r/>
           </w:p>
         </w:tc>
         <w:tc>
@@ -9021,7 +8173,6 @@
             <w:r>
               <w:t>Week 18: Practical - Finalize Project Assessment</w:t>
             </w:r>
-            <w:r/>
           </w:p>
           <w:p>
             <w:pPr>
@@ -9030,7 +8181,6 @@
             <w:r>
               <w:t>Final adjustments to the model and prepare a white paper</w:t>
             </w:r>
-            <w:r/>
           </w:p>
         </w:tc>
         <w:tc>
@@ -9050,9 +8200,6 @@
                 <w:szCs w:val="20"/>
               </w:rPr>
             </w:pPr>
-          </w:p>
-          <w:p>
-            <w:r/>
           </w:p>
         </w:tc>
         <w:tc>
@@ -9073,21 +8220,17 @@
                 <w:szCs w:val="20"/>
               </w:rPr>
             </w:pPr>
-            <w:r/>
-            <w:r/>
-            <w:hyperlink r:id="rId82">
+          </w:p>
+          <w:p>
+            <w:hyperlink r:id="rId82" w:history="1">
               <w:r>
                 <w:rPr>
-                  <w:color w:val="0000EE"/>
+                  <w:color w:val="0000FF"/>
                   <w:u w:val="single"/>
                 </w:rPr>
                 <w:t>IIIc. Superalignment</w:t>
               </w:r>
             </w:hyperlink>
-            <w:r>
-              <w:br/>
-            </w:r>
-            <w:r/>
           </w:p>
         </w:tc>
         <w:tc>
@@ -9208,9 +8351,6 @@
               <w:t>Week 19: Non Contact Assessment Feedback Week</w:t>
             </w:r>
           </w:p>
-          <w:p>
-            <w:r/>
-          </w:p>
         </w:tc>
         <w:tc>
           <w:tcPr>
@@ -9229,9 +8369,6 @@
                 <w:szCs w:val="20"/>
               </w:rPr>
             </w:pPr>
-          </w:p>
-          <w:p>
-            <w:r/>
           </w:p>
         </w:tc>
         <w:tc>
@@ -9252,21 +8389,17 @@
                 <w:szCs w:val="20"/>
               </w:rPr>
             </w:pPr>
-            <w:r/>
-            <w:r/>
-            <w:hyperlink r:id="rId83">
+          </w:p>
+          <w:p>
+            <w:hyperlink r:id="rId83" w:history="1">
               <w:r>
                 <w:rPr>
-                  <w:color w:val="0000EE"/>
+                  <w:color w:val="0000FF"/>
                   <w:u w:val="single"/>
                 </w:rPr>
                 <w:t>IIId. The Free World Must Prevail</w:t>
               </w:r>
             </w:hyperlink>
-            <w:r>
-              <w:br/>
-            </w:r>
-            <w:r/>
           </w:p>
         </w:tc>
         <w:tc>
@@ -9386,9 +8519,6 @@
               <w:t>Week 20: Resubmission Period</w:t>
             </w:r>
           </w:p>
-          <w:p>
-            <w:r/>
-          </w:p>
         </w:tc>
         <w:tc>
           <w:tcPr>
@@ -9407,9 +8537,6 @@
                 <w:szCs w:val="20"/>
               </w:rPr>
             </w:pPr>
-          </w:p>
-          <w:p>
-            <w:r/>
           </w:p>
         </w:tc>
         <w:tc>
@@ -9430,36 +8557,26 @@
                 <w:szCs w:val="20"/>
               </w:rPr>
             </w:pPr>
-            <w:r/>
-            <w:r/>
-            <w:hyperlink r:id="rId84">
+          </w:p>
+          <w:p>
+            <w:hyperlink r:id="rId84" w:history="1">
               <w:r>
                 <w:rPr>
-                  <w:color w:val="0000EE"/>
+                  <w:color w:val="0000FF"/>
                   <w:u w:val="single"/>
                 </w:rPr>
                 <w:t>IV. The Project</w:t>
               </w:r>
             </w:hyperlink>
-            <w:r>
-              <w:br/>
-            </w:r>
-            <w:r/>
-            <w:r/>
-            <w:r/>
-            <w:hyperlink r:id="rId85">
+            <w:hyperlink r:id="rId85" w:history="1">
               <w:r>
                 <w:rPr>
-                  <w:color w:val="0000EE"/>
+                  <w:color w:val="0000FF"/>
                   <w:u w:val="single"/>
                 </w:rPr>
                 <w:t>V. Parting Thoughts</w:t>
               </w:r>
             </w:hyperlink>
-            <w:r>
-              <w:br/>
-            </w:r>
-            <w:r/>
           </w:p>
         </w:tc>
         <w:tc>

</xml_diff>